<commit_message>
Laboratorio 7: diagrama UML.
</commit_message>
<xml_diff>
--- a/1_Practicas/06_Descripcion/docs/Practica_6_POO.docx
+++ b/1_Practicas/06_Descripcion/docs/Practica_6_POO.docx
@@ -1934,21 +1934,7 @@
         <w:rPr>
           <w:rFonts w:ascii="Proxima Nova" w:eastAsia="Proxima Nova" w:hAnsi="Proxima Nova" w:cs="Proxima Nova"/>
         </w:rPr>
-        <w:t xml:space="preserve">JDK (Java </w:t>
-      </w:r>
-      <w:proofErr w:type="spellStart"/>
-      <w:r>
-        <w:rPr>
-          <w:rFonts w:ascii="Proxima Nova" w:eastAsia="Proxima Nova" w:hAnsi="Proxima Nova" w:cs="Proxima Nova"/>
-        </w:rPr>
-        <w:t>Development</w:t>
-      </w:r>
-      <w:proofErr w:type="spellEnd"/>
-      <w:r>
-        <w:rPr>
-          <w:rFonts w:ascii="Proxima Nova" w:eastAsia="Proxima Nova" w:hAnsi="Proxima Nova" w:cs="Proxima Nova"/>
-        </w:rPr>
-        <w:t xml:space="preserve"> Kit).</w:t>
+        <w:t>JDK (Java Development Kit).</w:t>
       </w:r>
     </w:p>
     <w:p>
@@ -2002,23 +1988,7 @@
     </w:p>
     <w:p>
       <w:r>
-        <w:t xml:space="preserve">A diferencia de prácticas anteriores, aquí el enunciado no dictaba una lista cerrada de clases con sus atributos, sino un conjunto de reglas de negocio: quién puede hacer qué, </w:t>
-      </w:r>
-      <w:proofErr w:type="gramStart"/>
-      <w:r>
-        <w:t>bajo qué condiciones</w:t>
-      </w:r>
-      <w:proofErr w:type="gramEnd"/>
-      <w:r>
-        <w:t xml:space="preserve"> y con qué límites. El trabajo de análisis consistió entonces en decidir cuántas clases hacían falta, qué información guardaba cada una y, sobre todo, qué tipo de relación existía entre ellas. Terminé con cuatro clases: Mascota y Doctor como entidades de datos, Veterinaria como la clase que concentra las reglas del negocio y el control de acceso, y Main como punto de entrada con el menú, ya que el enunciado pedía explícitamente que la veterinaria no fuera el </w:t>
-      </w:r>
-      <w:proofErr w:type="spellStart"/>
-      <w:r>
-        <w:t>main</w:t>
-      </w:r>
-      <w:proofErr w:type="spellEnd"/>
-      <w:r>
-        <w:t>.</w:t>
+        <w:t>A diferencia de prácticas anteriores, aquí el enunciado no dictaba una lista cerrada de clases con sus atributos, sino un conjunto de reglas de negocio: quién puede hacer qué, bajo qué condiciones y con qué límites. El trabajo de análisis consistió entonces en decidir cuántas clases hacían falta, qué información guardaba cada una y, sobre todo, qué tipo de relación existía entre ellas. Terminé con cuatro clases: Mascota y Doctor como entidades de datos, Veterinaria como la clase que concentra las reglas del negocio y el control de acceso, y Main como punto de entrada con el menú, ya que el enunciado pedía explícitamente que la veterinaria no fuera el main.</w:t>
       </w:r>
     </w:p>
     <w:p>
@@ -2040,23 +2010,7 @@
         </w:numPr>
       </w:pPr>
       <w:r>
-        <w:t>La Veterinaria mantiene a sus doctores y a sus mascotas en arreglos de tamaño fijo (</w:t>
-      </w:r>
-      <w:proofErr w:type="gramStart"/>
-      <w:r>
-        <w:t>Doctor[</w:t>
-      </w:r>
-      <w:proofErr w:type="gramEnd"/>
-      <w:r>
-        <w:t xml:space="preserve">10] y </w:t>
-      </w:r>
-      <w:proofErr w:type="gramStart"/>
-      <w:r>
-        <w:t>Mascota[</w:t>
-      </w:r>
-      <w:proofErr w:type="gramEnd"/>
-      <w:r>
-        <w:t>50]) con su respectivo contador, y es ella quien los crea al contratar un doctor o al dar de alta una mascota. Esa relación es de composición: si la veterinaria deja de existir, sus doctores y sus mascotas dejan de existir con ella.</w:t>
+        <w:t>La Veterinaria mantiene a sus doctores y a sus mascotas en arreglos de tamaño fijo (Doctor[10] y Mascota[50]) con su respectivo contador, y es ella quien los crea al contratar un doctor o al dar de alta una mascota. Esa relación es de composición: si la veterinaria deja de existir, sus doctores y sus mascotas dejan de existir con ella.</w:t>
       </w:r>
     </w:p>
     <w:p>
@@ -2073,15 +2027,7 @@
         </w:numPr>
       </w:pPr>
       <w:r>
-        <w:t xml:space="preserve">El Doctor guarda además un arreglo </w:t>
-      </w:r>
-      <w:proofErr w:type="spellStart"/>
-      <w:r>
-        <w:t>mascotasAtendidas</w:t>
-      </w:r>
-      <w:proofErr w:type="spellEnd"/>
-      <w:r>
-        <w:t xml:space="preserve"> con las mascotas a las que ya les dio un diagnóstico. Esta relación es de asociación y no de composición, porque el doctor solamente conserva una referencia a mascotas que la Veterinaria ya había creado: no las construye ni controla su ciclo de vida</w:t>
+        <w:t>El Doctor guarda además un arreglo mascotasAtendidas con las mascotas a las que ya les dio un diagnóstico. Esta relación es de asociación y no de composición, porque el doctor solamente conserva una referencia a mascotas que la Veterinaria ya había creado: no las construye ni controla su ciclo de vida</w:t>
       </w:r>
       <w:r>
         <w:t>.</w:t>
@@ -2124,49 +2070,7 @@
         </w:numPr>
       </w:pPr>
       <w:r>
-        <w:t xml:space="preserve">El control de acceso vive completo dentro de la Veterinaria y no en el menú: cada operación verifica primero si hay sesión de super usuario o de doctor, y las tres acciones sobre mascotas comparten un método privado </w:t>
-      </w:r>
-      <w:proofErr w:type="spellStart"/>
-      <w:proofErr w:type="gramStart"/>
-      <w:r>
-        <w:t>puedeOperarComoDoctor</w:t>
-      </w:r>
-      <w:proofErr w:type="spellEnd"/>
-      <w:r>
-        <w:t>(</w:t>
-      </w:r>
-      <w:proofErr w:type="gramEnd"/>
-      <w:r>
-        <w:t xml:space="preserve">) que rechaza la operación si no hay doctor </w:t>
-      </w:r>
-      <w:proofErr w:type="spellStart"/>
-      <w:r>
-        <w:t>logueado</w:t>
-      </w:r>
-      <w:proofErr w:type="spellEnd"/>
-      <w:r>
-        <w:t xml:space="preserve"> o si el doctor está suspendido. La información sensible se protegió con encapsulamiento; por ejemplo, la clave del doctor no tiene </w:t>
-      </w:r>
-      <w:proofErr w:type="spellStart"/>
-      <w:r>
-        <w:t>getter</w:t>
-      </w:r>
-      <w:proofErr w:type="spellEnd"/>
-      <w:r>
-        <w:t xml:space="preserve"> y solo puede comprobarse con </w:t>
-      </w:r>
-      <w:proofErr w:type="spellStart"/>
-      <w:proofErr w:type="gramStart"/>
-      <w:r>
-        <w:t>verificarClave</w:t>
-      </w:r>
-      <w:proofErr w:type="spellEnd"/>
-      <w:r>
-        <w:t>(</w:t>
-      </w:r>
-      <w:proofErr w:type="gramEnd"/>
-      <w:r>
-        <w:t>).</w:t>
+        <w:t>El control de acceso vive completo dentro de la Veterinaria y no en el menú: cada operación verifica primero si hay sesión de super usuario o de doctor, y las tres acciones sobre mascotas comparten un método privado puedeOperarComoDoctor() que rechaza la operación si no hay doctor logueado o si el doctor está suspendido. La información sensible se protegió con encapsulamiento; por ejemplo, la clave del doctor no tiene getter y solo puede comprobarse con verificarClave().</w:t>
       </w:r>
     </w:p>
     <w:p>
@@ -2253,23 +2157,7 @@
         </w:numPr>
       </w:pPr>
       <w:r>
-        <w:t xml:space="preserve">Mensajes de confirmación con el identificador que asignó el sistema (por ejemplo, "Doctor contratado con </w:t>
-      </w:r>
-      <w:proofErr w:type="spellStart"/>
-      <w:r>
-        <w:t>exito</w:t>
-      </w:r>
-      <w:proofErr w:type="spellEnd"/>
-      <w:r>
-        <w:t xml:space="preserve">. Numero de empleado: 1" o "Mascota registrada con </w:t>
-      </w:r>
-      <w:proofErr w:type="spellStart"/>
-      <w:r>
-        <w:t>exito</w:t>
-      </w:r>
-      <w:proofErr w:type="spellEnd"/>
-      <w:r>
-        <w:t>. Id: 1").</w:t>
+        <w:t>Mensajes de confirmación con el identificador que asignó el sistema (por ejemplo, "Doctor contratado con exito. Numero de empleado: 1" o "Mascota registrada con exito. Id: 1").</w:t>
       </w:r>
     </w:p>
     <w:p>
@@ -2281,28 +2169,7 @@
         </w:numPr>
       </w:pPr>
       <w:r>
-        <w:t xml:space="preserve">Listados de doctores y de mascotas generados con el </w:t>
-      </w:r>
-      <w:proofErr w:type="spellStart"/>
-      <w:proofErr w:type="gramStart"/>
-      <w:r>
-        <w:t>toString</w:t>
-      </w:r>
-      <w:proofErr w:type="spellEnd"/>
-      <w:r>
-        <w:t>(</w:t>
-      </w:r>
-      <w:proofErr w:type="gramEnd"/>
-      <w:r>
-        <w:t xml:space="preserve">) de cada clase, alineados en columnas con </w:t>
-      </w:r>
-      <w:proofErr w:type="spellStart"/>
-      <w:r>
-        <w:t>String.format</w:t>
-      </w:r>
-      <w:proofErr w:type="spellEnd"/>
-      <w:r>
-        <w:t>() para que puedan leerse como una tabla.</w:t>
+        <w:t>Listados de doctores y de mascotas generados con el toString() de cada clase, alineados en columnas con String.format() para que puedan leerse como una tabla.</w:t>
       </w:r>
     </w:p>
     <w:p>
@@ -2343,10 +2210,18 @@
         </w:rPr>
         <w:lastRenderedPageBreak/>
         <w:drawing>
-          <wp:inline distT="0" distB="0" distL="0" distR="0" wp14:anchorId="49941E96" wp14:editId="3AD0FE94">
-            <wp:extent cx="6400000" cy="7520000"/>
-            <wp:effectExtent l="0" t="0" r="9525" b="9525"/>
-            <wp:docPr id="2111530659" name="Imagen 1"/>
+          <wp:anchor distT="0" distB="0" distL="114300" distR="114300" simplePos="0" relativeHeight="251658240" behindDoc="0" locked="0" layoutInCell="1" allowOverlap="1" wp14:anchorId="76AAF768" wp14:editId="490959E2">
+            <wp:simplePos x="0" y="0"/>
+            <wp:positionH relativeFrom="margin">
+              <wp:align>center</wp:align>
+            </wp:positionH>
+            <wp:positionV relativeFrom="paragraph">
+              <wp:posOffset>8832</wp:posOffset>
+            </wp:positionV>
+            <wp:extent cx="5432645" cy="8009632"/>
+            <wp:effectExtent l="0" t="0" r="0" b="0"/>
+            <wp:wrapTopAndBottom/>
+            <wp:docPr id="81670601" name="Imagen 2"/>
             <wp:cNvGraphicFramePr>
               <a:graphicFrameLocks xmlns:a="http://schemas.openxmlformats.org/drawingml/2006/main" noChangeAspect="1"/>
             </wp:cNvGraphicFramePr>
@@ -2354,11 +2229,11 @@
               <a:graphicData uri="http://schemas.openxmlformats.org/drawingml/2006/picture">
                 <pic:pic xmlns:pic="http://schemas.openxmlformats.org/drawingml/2006/picture">
                   <pic:nvPicPr>
-                    <pic:cNvPr id="2111530659" name="Imagen 2111530659"/>
+                    <pic:cNvPr id="81670601" name="Imagen 81670601"/>
                     <pic:cNvPicPr/>
                   </pic:nvPicPr>
                   <pic:blipFill>
-                    <a:blip r:embed="rId13" cstate="print">
+                    <a:blip r:embed="rId13">
                       <a:extLst>
                         <a:ext uri="{28A0092B-C50C-407E-A947-70E740481C1C}">
                           <a14:useLocalDpi xmlns:a14="http://schemas.microsoft.com/office/drawing/2010/main" val="0"/>
@@ -2372,7 +2247,7 @@
                   <pic:spPr>
                     <a:xfrm>
                       <a:off x="0" y="0"/>
-                      <a:ext cx="6400000" cy="7520000"/>
+                      <a:ext cx="5432645" cy="8009632"/>
                     </a:xfrm>
                     <a:prstGeom prst="rect">
                       <a:avLst/>
@@ -2381,7 +2256,13 @@
                 </pic:pic>
               </a:graphicData>
             </a:graphic>
-          </wp:inline>
+            <wp14:sizeRelH relativeFrom="page">
+              <wp14:pctWidth>0</wp14:pctWidth>
+            </wp14:sizeRelH>
+            <wp14:sizeRelV relativeFrom="page">
+              <wp14:pctHeight>0</wp14:pctHeight>
+            </wp14:sizeRelV>
+          </wp:anchor>
         </w:drawing>
       </w:r>
     </w:p>
@@ -2433,6 +2314,9 @@
       <w:pPr>
         <w:pStyle w:val="Ttulo3"/>
         <w:spacing w:before="240" w:after="120"/>
+        <w:rPr>
+          <w:rFonts w:ascii="Calibri" w:eastAsia="Calibri" w:hAnsi="Calibri" w:cs="Calibri"/>
+        </w:rPr>
       </w:pPr>
       <w:bookmarkStart w:id="9" w:name="_Toc239939358"/>
       <w:r>
@@ -2443,347 +2327,38 @@
       </w:r>
       <w:bookmarkEnd w:id="9"/>
     </w:p>
-    <w:p>
-      <w:pPr>
-        <w:pBdr>
-          <w:top w:val="single" w:sz="4" w:space="0" w:color="CCCCCC"/>
-        </w:pBdr>
-        <w:shd w:val="clear" w:color="auto" w:fill="F2F2F2"/>
-      </w:pPr>
-      <w:proofErr w:type="spellStart"/>
-      <w:r>
-        <w:rPr>
-          <w:rFonts w:ascii="Consolas" w:eastAsia="Consolas" w:hAnsi="Consolas" w:cs="Consolas"/>
-          <w:sz w:val="19"/>
-          <w:szCs w:val="19"/>
-        </w:rPr>
-        <w:t>public</w:t>
-      </w:r>
-      <w:proofErr w:type="spellEnd"/>
-      <w:r>
-        <w:rPr>
-          <w:rFonts w:ascii="Consolas" w:eastAsia="Consolas" w:hAnsi="Consolas" w:cs="Consolas"/>
-          <w:sz w:val="19"/>
-          <w:szCs w:val="19"/>
-        </w:rPr>
-        <w:t xml:space="preserve"> </w:t>
-      </w:r>
-      <w:proofErr w:type="spellStart"/>
-      <w:r>
-        <w:rPr>
-          <w:rFonts w:ascii="Consolas" w:eastAsia="Consolas" w:hAnsi="Consolas" w:cs="Consolas"/>
-          <w:sz w:val="19"/>
-          <w:szCs w:val="19"/>
-        </w:rPr>
-        <w:t>boolean</w:t>
-      </w:r>
-      <w:proofErr w:type="spellEnd"/>
-      <w:r>
-        <w:rPr>
-          <w:rFonts w:ascii="Consolas" w:eastAsia="Consolas" w:hAnsi="Consolas" w:cs="Consolas"/>
-          <w:sz w:val="19"/>
-          <w:szCs w:val="19"/>
-        </w:rPr>
-        <w:t xml:space="preserve"> </w:t>
-      </w:r>
-      <w:proofErr w:type="spellStart"/>
-      <w:proofErr w:type="gramStart"/>
-      <w:r>
-        <w:rPr>
-          <w:rFonts w:ascii="Consolas" w:eastAsia="Consolas" w:hAnsi="Consolas" w:cs="Consolas"/>
-          <w:sz w:val="19"/>
-          <w:szCs w:val="19"/>
-        </w:rPr>
-        <w:t>tieneDiagnostico</w:t>
-      </w:r>
-      <w:proofErr w:type="spellEnd"/>
-      <w:r>
-        <w:rPr>
-          <w:rFonts w:ascii="Consolas" w:eastAsia="Consolas" w:hAnsi="Consolas" w:cs="Consolas"/>
-          <w:sz w:val="19"/>
-          <w:szCs w:val="19"/>
-        </w:rPr>
-        <w:t>(){</w:t>
-      </w:r>
-      <w:proofErr w:type="gramEnd"/>
-    </w:p>
-    <w:p>
-      <w:pPr>
-        <w:shd w:val="clear" w:color="auto" w:fill="F2F2F2"/>
-      </w:pPr>
-      <w:r>
-        <w:rPr>
-          <w:rFonts w:ascii="Consolas" w:eastAsia="Consolas" w:hAnsi="Consolas" w:cs="Consolas"/>
-          <w:sz w:val="19"/>
-          <w:szCs w:val="19"/>
-        </w:rPr>
-        <w:t xml:space="preserve">  </w:t>
-      </w:r>
-      <w:proofErr w:type="spellStart"/>
-      <w:r>
-        <w:rPr>
-          <w:rFonts w:ascii="Consolas" w:eastAsia="Consolas" w:hAnsi="Consolas" w:cs="Consolas"/>
-          <w:sz w:val="19"/>
-          <w:szCs w:val="19"/>
-        </w:rPr>
-        <w:t>return</w:t>
-      </w:r>
-      <w:proofErr w:type="spellEnd"/>
-      <w:r>
-        <w:rPr>
-          <w:rFonts w:ascii="Consolas" w:eastAsia="Consolas" w:hAnsi="Consolas" w:cs="Consolas"/>
-          <w:sz w:val="19"/>
-          <w:szCs w:val="19"/>
-        </w:rPr>
-        <w:t xml:space="preserve"> </w:t>
-      </w:r>
-      <w:proofErr w:type="gramStart"/>
-      <w:r>
-        <w:rPr>
-          <w:rFonts w:ascii="Consolas" w:eastAsia="Consolas" w:hAnsi="Consolas" w:cs="Consolas"/>
-          <w:sz w:val="19"/>
-          <w:szCs w:val="19"/>
-        </w:rPr>
-        <w:t>diagnostico !</w:t>
-      </w:r>
-      <w:proofErr w:type="gramEnd"/>
-      <w:r>
-        <w:rPr>
-          <w:rFonts w:ascii="Consolas" w:eastAsia="Consolas" w:hAnsi="Consolas" w:cs="Consolas"/>
-          <w:sz w:val="19"/>
-          <w:szCs w:val="19"/>
-        </w:rPr>
-        <w:t xml:space="preserve">= </w:t>
-      </w:r>
-      <w:proofErr w:type="spellStart"/>
-      <w:r>
-        <w:rPr>
-          <w:rFonts w:ascii="Consolas" w:eastAsia="Consolas" w:hAnsi="Consolas" w:cs="Consolas"/>
-          <w:sz w:val="19"/>
-          <w:szCs w:val="19"/>
-        </w:rPr>
-        <w:t>null</w:t>
-      </w:r>
-      <w:proofErr w:type="spellEnd"/>
-      <w:r>
-        <w:rPr>
-          <w:rFonts w:ascii="Consolas" w:eastAsia="Consolas" w:hAnsi="Consolas" w:cs="Consolas"/>
-          <w:sz w:val="19"/>
-          <w:szCs w:val="19"/>
-        </w:rPr>
-        <w:t xml:space="preserve"> &amp;</w:t>
-      </w:r>
-      <w:proofErr w:type="gramStart"/>
-      <w:r>
-        <w:rPr>
-          <w:rFonts w:ascii="Consolas" w:eastAsia="Consolas" w:hAnsi="Consolas" w:cs="Consolas"/>
-          <w:sz w:val="19"/>
-          <w:szCs w:val="19"/>
-        </w:rPr>
-        <w:t>&amp; !</w:t>
-      </w:r>
-      <w:proofErr w:type="spellStart"/>
-      <w:r>
-        <w:rPr>
-          <w:rFonts w:ascii="Consolas" w:eastAsia="Consolas" w:hAnsi="Consolas" w:cs="Consolas"/>
-          <w:sz w:val="19"/>
-          <w:szCs w:val="19"/>
-        </w:rPr>
-        <w:t>diagnostico</w:t>
-      </w:r>
-      <w:proofErr w:type="gramEnd"/>
-      <w:r>
-        <w:rPr>
-          <w:rFonts w:ascii="Consolas" w:eastAsia="Consolas" w:hAnsi="Consolas" w:cs="Consolas"/>
-          <w:sz w:val="19"/>
-          <w:szCs w:val="19"/>
-        </w:rPr>
-        <w:t>.</w:t>
-      </w:r>
-      <w:proofErr w:type="gramStart"/>
-      <w:r>
-        <w:rPr>
-          <w:rFonts w:ascii="Consolas" w:eastAsia="Consolas" w:hAnsi="Consolas" w:cs="Consolas"/>
-          <w:sz w:val="19"/>
-          <w:szCs w:val="19"/>
-        </w:rPr>
-        <w:t>isEmpty</w:t>
-      </w:r>
-      <w:proofErr w:type="spellEnd"/>
-      <w:r>
-        <w:rPr>
-          <w:rFonts w:ascii="Consolas" w:eastAsia="Consolas" w:hAnsi="Consolas" w:cs="Consolas"/>
-          <w:sz w:val="19"/>
-          <w:szCs w:val="19"/>
-        </w:rPr>
-        <w:t>(</w:t>
-      </w:r>
-      <w:proofErr w:type="gramEnd"/>
-      <w:r>
-        <w:rPr>
-          <w:rFonts w:ascii="Consolas" w:eastAsia="Consolas" w:hAnsi="Consolas" w:cs="Consolas"/>
-          <w:sz w:val="19"/>
-          <w:szCs w:val="19"/>
-        </w:rPr>
-        <w:t>);</w:t>
-      </w:r>
-    </w:p>
-    <w:p>
-      <w:pPr>
-        <w:shd w:val="clear" w:color="auto" w:fill="F2F2F2"/>
-      </w:pPr>
-      <w:r>
-        <w:rPr>
-          <w:rFonts w:ascii="Consolas" w:eastAsia="Consolas" w:hAnsi="Consolas" w:cs="Consolas"/>
-          <w:sz w:val="19"/>
-          <w:szCs w:val="19"/>
-        </w:rPr>
-        <w:t>}</w:t>
-      </w:r>
-    </w:p>
-    <w:p>
-      <w:pPr>
-        <w:shd w:val="clear" w:color="auto" w:fill="F2F2F2"/>
-      </w:pPr>
-      <w:r>
-        <w:rPr>
-          <w:rFonts w:ascii="Consolas" w:eastAsia="Consolas" w:hAnsi="Consolas" w:cs="Consolas"/>
-          <w:sz w:val="19"/>
-          <w:szCs w:val="19"/>
-        </w:rPr>
-        <w:t xml:space="preserve"> </w:t>
-      </w:r>
-    </w:p>
-    <w:p>
-      <w:pPr>
-        <w:shd w:val="clear" w:color="auto" w:fill="F2F2F2"/>
-      </w:pPr>
-      <w:proofErr w:type="spellStart"/>
-      <w:r>
-        <w:rPr>
-          <w:rFonts w:ascii="Consolas" w:eastAsia="Consolas" w:hAnsi="Consolas" w:cs="Consolas"/>
-          <w:sz w:val="19"/>
-          <w:szCs w:val="19"/>
-        </w:rPr>
-        <w:t>return</w:t>
-      </w:r>
-      <w:proofErr w:type="spellEnd"/>
-      <w:r>
-        <w:rPr>
-          <w:rFonts w:ascii="Consolas" w:eastAsia="Consolas" w:hAnsi="Consolas" w:cs="Consolas"/>
-          <w:sz w:val="19"/>
-          <w:szCs w:val="19"/>
-        </w:rPr>
-        <w:t xml:space="preserve"> </w:t>
-      </w:r>
-      <w:proofErr w:type="spellStart"/>
-      <w:r>
-        <w:rPr>
-          <w:rFonts w:ascii="Consolas" w:eastAsia="Consolas" w:hAnsi="Consolas" w:cs="Consolas"/>
-          <w:sz w:val="19"/>
-          <w:szCs w:val="19"/>
-        </w:rPr>
-        <w:t>String.format</w:t>
-      </w:r>
-      <w:proofErr w:type="spellEnd"/>
-      <w:r>
-        <w:rPr>
-          <w:rFonts w:ascii="Consolas" w:eastAsia="Consolas" w:hAnsi="Consolas" w:cs="Consolas"/>
-          <w:sz w:val="19"/>
-          <w:szCs w:val="19"/>
-        </w:rPr>
-        <w:t xml:space="preserve">("[Mascota %-2d]\t%-10s (%-8s, %2d </w:t>
-      </w:r>
-      <w:proofErr w:type="spellStart"/>
-      <w:r>
-        <w:rPr>
-          <w:rFonts w:ascii="Consolas" w:eastAsia="Consolas" w:hAnsi="Consolas" w:cs="Consolas"/>
-          <w:sz w:val="19"/>
-          <w:szCs w:val="19"/>
-        </w:rPr>
-        <w:t>anios</w:t>
-      </w:r>
-      <w:proofErr w:type="spellEnd"/>
-      <w:r>
-        <w:rPr>
-          <w:rFonts w:ascii="Consolas" w:eastAsia="Consolas" w:hAnsi="Consolas" w:cs="Consolas"/>
-          <w:sz w:val="19"/>
-          <w:szCs w:val="19"/>
-        </w:rPr>
-        <w:t xml:space="preserve">) | Dueño: %-17s, tel. %-14s | Diagnostico: %s", id, nombre, especie, edad, </w:t>
-      </w:r>
-      <w:proofErr w:type="spellStart"/>
-      <w:r>
-        <w:rPr>
-          <w:rFonts w:ascii="Consolas" w:eastAsia="Consolas" w:hAnsi="Consolas" w:cs="Consolas"/>
-          <w:sz w:val="19"/>
-          <w:szCs w:val="19"/>
-        </w:rPr>
-        <w:t>nombreDueno</w:t>
-      </w:r>
-      <w:proofErr w:type="spellEnd"/>
-      <w:r>
-        <w:rPr>
-          <w:rFonts w:ascii="Consolas" w:eastAsia="Consolas" w:hAnsi="Consolas" w:cs="Consolas"/>
-          <w:sz w:val="19"/>
-          <w:szCs w:val="19"/>
-        </w:rPr>
-        <w:t xml:space="preserve">, </w:t>
-      </w:r>
-      <w:proofErr w:type="spellStart"/>
-      <w:r>
-        <w:rPr>
-          <w:rFonts w:ascii="Consolas" w:eastAsia="Consolas" w:hAnsi="Consolas" w:cs="Consolas"/>
-          <w:sz w:val="19"/>
-          <w:szCs w:val="19"/>
-        </w:rPr>
-        <w:t>telefonoDueno</w:t>
-      </w:r>
-      <w:proofErr w:type="spellEnd"/>
-      <w:r>
-        <w:rPr>
-          <w:rFonts w:ascii="Consolas" w:eastAsia="Consolas" w:hAnsi="Consolas" w:cs="Consolas"/>
-          <w:sz w:val="19"/>
-          <w:szCs w:val="19"/>
-        </w:rPr>
-        <w:t xml:space="preserve">, </w:t>
-      </w:r>
-      <w:proofErr w:type="spellStart"/>
-      <w:r>
-        <w:rPr>
-          <w:rFonts w:ascii="Consolas" w:eastAsia="Consolas" w:hAnsi="Consolas" w:cs="Consolas"/>
-          <w:sz w:val="19"/>
-          <w:szCs w:val="19"/>
-        </w:rPr>
-        <w:t>diag</w:t>
-      </w:r>
-      <w:proofErr w:type="spellEnd"/>
-      <w:r>
-        <w:rPr>
-          <w:rFonts w:ascii="Consolas" w:eastAsia="Consolas" w:hAnsi="Consolas" w:cs="Consolas"/>
-          <w:sz w:val="19"/>
-          <w:szCs w:val="19"/>
-        </w:rPr>
-        <w:t>);</w:t>
-      </w:r>
-    </w:p>
-    <w:p>
-      <w:pPr>
-        <w:pBdr>
-          <w:bottom w:val="single" w:sz="4" w:space="0" w:color="CCCCCC"/>
-        </w:pBdr>
-        <w:shd w:val="clear" w:color="auto" w:fill="F2F2F2"/>
-        <w:spacing w:after="200"/>
-      </w:pPr>
-      <w:r>
-        <w:rPr>
-          <w:rFonts w:ascii="Consolas" w:eastAsia="Consolas" w:hAnsi="Consolas" w:cs="Consolas"/>
-          <w:sz w:val="19"/>
-          <w:szCs w:val="19"/>
-        </w:rPr>
-        <w:t xml:space="preserve"> </w:t>
-      </w:r>
-    </w:p>
+    <w:bookmarkStart w:id="10" w:name="_MON_1851072035"/>
+    <w:bookmarkEnd w:id="10"/>
+    <w:p>
+      <w:r>
+        <w:object w:dxaOrig="12240" w:dyaOrig="3990" w14:anchorId="088F621A">
+          <v:shapetype id="_x0000_t75" coordsize="21600,21600" o:spt="75" o:preferrelative="t" path="m@4@5l@4@11@9@11@9@5xe" filled="f" stroked="f">
+            <v:stroke joinstyle="miter"/>
+            <v:formulas>
+              <v:f eqn="if lineDrawn pixelLineWidth 0"/>
+              <v:f eqn="sum @0 1 0"/>
+              <v:f eqn="sum 0 0 @1"/>
+              <v:f eqn="prod @2 1 2"/>
+              <v:f eqn="prod @3 21600 pixelWidth"/>
+              <v:f eqn="prod @3 21600 pixelHeight"/>
+              <v:f eqn="sum @0 0 1"/>
+              <v:f eqn="prod @6 1 2"/>
+              <v:f eqn="prod @7 21600 pixelWidth"/>
+              <v:f eqn="sum @8 21600 0"/>
+              <v:f eqn="prod @7 21600 pixelHeight"/>
+              <v:f eqn="sum @10 21600 0"/>
+            </v:formulas>
+            <v:path o:extrusionok="f" gradientshapeok="t" o:connecttype="rect"/>
+            <o:lock v:ext="edit" aspectratio="t"/>
+          </v:shapetype>
+          <v:shape id="_x0000_i1033" type="#_x0000_t75" style="width:612pt;height:199.65pt" o:ole="">
+            <v:imagedata r:id="rId14" o:title=""/>
+          </v:shape>
+          <o:OLEObject Type="Embed" ProgID="Word.OpenDocumentText.12" ShapeID="_x0000_i1033" DrawAspect="Content" ObjectID="_1851072666" r:id="rId15"/>
+        </w:object>
+      </w:r>
+    </w:p>
+    <w:p/>
     <w:p>
       <w:pPr>
         <w:spacing w:after="160"/>
@@ -2796,79 +2371,7 @@
         <w:rPr>
           <w:rFonts w:ascii="Calibri" w:eastAsia="Calibri" w:hAnsi="Calibri" w:cs="Calibri"/>
         </w:rPr>
-        <w:t xml:space="preserve">Mascota es una clase de datos: guarda la información sensible de la mascota y la de su dueño, más el diagnóstico, que arranca en </w:t>
-      </w:r>
-      <w:proofErr w:type="spellStart"/>
-      <w:r>
-        <w:rPr>
-          <w:rFonts w:ascii="Calibri" w:eastAsia="Calibri" w:hAnsi="Calibri" w:cs="Calibri"/>
-        </w:rPr>
-        <w:t>null</w:t>
-      </w:r>
-      <w:proofErr w:type="spellEnd"/>
-      <w:r>
-        <w:rPr>
-          <w:rFonts w:ascii="Calibri" w:eastAsia="Calibri" w:hAnsi="Calibri" w:cs="Calibri"/>
-        </w:rPr>
-        <w:t xml:space="preserve"> porque una mascota recién registrada todavía no ha sido revisada. Por eso agregué </w:t>
-      </w:r>
-      <w:proofErr w:type="spellStart"/>
-      <w:proofErr w:type="gramStart"/>
-      <w:r>
-        <w:rPr>
-          <w:rFonts w:ascii="Calibri" w:eastAsia="Calibri" w:hAnsi="Calibri" w:cs="Calibri"/>
-        </w:rPr>
-        <w:t>tieneDiagnostico</w:t>
-      </w:r>
-      <w:proofErr w:type="spellEnd"/>
-      <w:r>
-        <w:rPr>
-          <w:rFonts w:ascii="Calibri" w:eastAsia="Calibri" w:hAnsi="Calibri" w:cs="Calibri"/>
-        </w:rPr>
-        <w:t>(</w:t>
-      </w:r>
-      <w:proofErr w:type="gramEnd"/>
-      <w:r>
-        <w:rPr>
-          <w:rFonts w:ascii="Calibri" w:eastAsia="Calibri" w:hAnsi="Calibri" w:cs="Calibri"/>
-        </w:rPr>
-        <w:t xml:space="preserve">), que comprueba </w:t>
-      </w:r>
-      <w:proofErr w:type="spellStart"/>
-      <w:r>
-        <w:rPr>
-          <w:rFonts w:ascii="Calibri" w:eastAsia="Calibri" w:hAnsi="Calibri" w:cs="Calibri"/>
-        </w:rPr>
-        <w:t>null</w:t>
-      </w:r>
-      <w:proofErr w:type="spellEnd"/>
-      <w:r>
-        <w:rPr>
-          <w:rFonts w:ascii="Calibri" w:eastAsia="Calibri" w:hAnsi="Calibri" w:cs="Calibri"/>
-        </w:rPr>
-        <w:t xml:space="preserve"> y cadena vacía a la vez, en lugar de dejar que cada clase que la use repita esa comprobación por su cuenta. En el </w:t>
-      </w:r>
-      <w:proofErr w:type="spellStart"/>
-      <w:proofErr w:type="gramStart"/>
-      <w:r>
-        <w:rPr>
-          <w:rFonts w:ascii="Calibri" w:eastAsia="Calibri" w:hAnsi="Calibri" w:cs="Calibri"/>
-        </w:rPr>
-        <w:t>toString</w:t>
-      </w:r>
-      <w:proofErr w:type="spellEnd"/>
-      <w:r>
-        <w:rPr>
-          <w:rFonts w:ascii="Calibri" w:eastAsia="Calibri" w:hAnsi="Calibri" w:cs="Calibri"/>
-        </w:rPr>
-        <w:t>(</w:t>
-      </w:r>
-      <w:proofErr w:type="gramEnd"/>
-      <w:r>
-        <w:rPr>
-          <w:rFonts w:ascii="Calibri" w:eastAsia="Calibri" w:hAnsi="Calibri" w:cs="Calibri"/>
-        </w:rPr>
-        <w:t>) alineé cada campo con anchos fijos (%-10s, %-8s, %2d) para que al imprimir varias mascotas se lean como una tabla y no como texto corrido; el punto final lo dejé fuera del formato, porque el propio texto del diagnóstico ya trae su puntuación.</w:t>
+        <w:t>Mascota es una clase de datos: guarda la información sensible de la mascota y la de su dueño, más el diagnóstico, que arranca en null porque una mascota recién registrada todavía no ha sido revisada. Por eso agregué tieneDiagnostico(), que comprueba null y cadena vacía a la vez, en lugar de dejar que cada clase que la use repita esa comprobación por su cuenta. En el toString() alineé cada campo con anchos fijos (%-10s, %-8s, %2d) para que al imprimir varias mascotas se lean como una tabla y no como texto corrido; el punto final lo dejé fuera del formato, porque el propio texto del diagnóstico ya trae su puntuación.</w:t>
       </w:r>
     </w:p>
     <w:p>
@@ -2897,7 +2400,7 @@
                     <pic:cNvPicPr/>
                   </pic:nvPicPr>
                   <pic:blipFill>
-                    <a:blip r:embed="rId14"/>
+                    <a:blip r:embed="rId16"/>
                     <a:stretch>
                       <a:fillRect/>
                     </a:stretch>
@@ -2948,291 +2451,36 @@
         <w:fldChar w:fldCharType="end"/>
       </w:r>
       <w:r>
-        <w:t xml:space="preserve">: Alta de las cuatro mascotas y salida del </w:t>
-      </w:r>
-      <w:proofErr w:type="spellStart"/>
-      <w:proofErr w:type="gramStart"/>
-      <w:r>
-        <w:t>toString</w:t>
-      </w:r>
-      <w:proofErr w:type="spellEnd"/>
-      <w:r>
-        <w:t>(</w:t>
-      </w:r>
-      <w:proofErr w:type="gramEnd"/>
-      <w:r>
-        <w:t>) de Mascota</w:t>
+        <w:t>: Alta de las cuatro mascotas y salida del toString() de Mascota</w:t>
       </w:r>
     </w:p>
     <w:p>
       <w:pPr>
         <w:pStyle w:val="Ttulo3"/>
         <w:spacing w:before="240" w:after="120"/>
-      </w:pPr>
-      <w:bookmarkStart w:id="10" w:name="_Toc239939359"/>
-      <w:r>
         <w:rPr>
           <w:rFonts w:ascii="Calibri" w:eastAsia="Calibri" w:hAnsi="Calibri" w:cs="Calibri"/>
         </w:rPr>
+      </w:pPr>
+      <w:bookmarkStart w:id="11" w:name="_Toc239939359"/>
+      <w:r>
+        <w:rPr>
+          <w:rFonts w:ascii="Calibri" w:eastAsia="Calibri" w:hAnsi="Calibri" w:cs="Calibri"/>
+        </w:rPr>
         <w:t>Clase Doctor</w:t>
       </w:r>
-      <w:bookmarkEnd w:id="10"/>
-    </w:p>
-    <w:p>
-      <w:pPr>
-        <w:pBdr>
-          <w:top w:val="single" w:sz="4" w:space="0" w:color="CCCCCC"/>
-        </w:pBdr>
-        <w:shd w:val="clear" w:color="auto" w:fill="F2F2F2"/>
-      </w:pPr>
-      <w:proofErr w:type="spellStart"/>
-      <w:r>
-        <w:rPr>
-          <w:rFonts w:ascii="Consolas" w:eastAsia="Consolas" w:hAnsi="Consolas" w:cs="Consolas"/>
-          <w:sz w:val="19"/>
-          <w:szCs w:val="19"/>
-        </w:rPr>
-        <w:t>public</w:t>
-      </w:r>
-      <w:proofErr w:type="spellEnd"/>
-      <w:r>
-        <w:rPr>
-          <w:rFonts w:ascii="Consolas" w:eastAsia="Consolas" w:hAnsi="Consolas" w:cs="Consolas"/>
-          <w:sz w:val="19"/>
-          <w:szCs w:val="19"/>
-        </w:rPr>
-        <w:t xml:space="preserve"> </w:t>
-      </w:r>
-      <w:proofErr w:type="spellStart"/>
-      <w:r>
-        <w:rPr>
-          <w:rFonts w:ascii="Consolas" w:eastAsia="Consolas" w:hAnsi="Consolas" w:cs="Consolas"/>
-          <w:sz w:val="19"/>
-          <w:szCs w:val="19"/>
-        </w:rPr>
-        <w:t>boolean</w:t>
-      </w:r>
-      <w:proofErr w:type="spellEnd"/>
-      <w:r>
-        <w:rPr>
-          <w:rFonts w:ascii="Consolas" w:eastAsia="Consolas" w:hAnsi="Consolas" w:cs="Consolas"/>
-          <w:sz w:val="19"/>
-          <w:szCs w:val="19"/>
-        </w:rPr>
-        <w:t xml:space="preserve"> </w:t>
-      </w:r>
-      <w:proofErr w:type="spellStart"/>
-      <w:proofErr w:type="gramStart"/>
-      <w:r>
-        <w:rPr>
-          <w:rFonts w:ascii="Consolas" w:eastAsia="Consolas" w:hAnsi="Consolas" w:cs="Consolas"/>
-          <w:sz w:val="19"/>
-          <w:szCs w:val="19"/>
-        </w:rPr>
-        <w:t>verificarClave</w:t>
-      </w:r>
-      <w:proofErr w:type="spellEnd"/>
-      <w:r>
-        <w:rPr>
-          <w:rFonts w:ascii="Consolas" w:eastAsia="Consolas" w:hAnsi="Consolas" w:cs="Consolas"/>
-          <w:sz w:val="19"/>
-          <w:szCs w:val="19"/>
-        </w:rPr>
-        <w:t>(</w:t>
-      </w:r>
-      <w:proofErr w:type="gramEnd"/>
-      <w:r>
-        <w:rPr>
-          <w:rFonts w:ascii="Consolas" w:eastAsia="Consolas" w:hAnsi="Consolas" w:cs="Consolas"/>
-          <w:sz w:val="19"/>
-          <w:szCs w:val="19"/>
-        </w:rPr>
-        <w:t xml:space="preserve">String </w:t>
-      </w:r>
-      <w:proofErr w:type="gramStart"/>
-      <w:r>
-        <w:rPr>
-          <w:rFonts w:ascii="Consolas" w:eastAsia="Consolas" w:hAnsi="Consolas" w:cs="Consolas"/>
-          <w:sz w:val="19"/>
-          <w:szCs w:val="19"/>
-        </w:rPr>
-        <w:t>intento){</w:t>
-      </w:r>
-      <w:proofErr w:type="gramEnd"/>
-      <w:r>
-        <w:rPr>
-          <w:rFonts w:ascii="Consolas" w:eastAsia="Consolas" w:hAnsi="Consolas" w:cs="Consolas"/>
-          <w:sz w:val="19"/>
-          <w:szCs w:val="19"/>
-        </w:rPr>
-        <w:t xml:space="preserve"> </w:t>
-      </w:r>
-      <w:proofErr w:type="spellStart"/>
-      <w:r>
-        <w:rPr>
-          <w:rFonts w:ascii="Consolas" w:eastAsia="Consolas" w:hAnsi="Consolas" w:cs="Consolas"/>
-          <w:sz w:val="19"/>
-          <w:szCs w:val="19"/>
-        </w:rPr>
-        <w:t>return</w:t>
-      </w:r>
-      <w:proofErr w:type="spellEnd"/>
-      <w:r>
-        <w:rPr>
-          <w:rFonts w:ascii="Consolas" w:eastAsia="Consolas" w:hAnsi="Consolas" w:cs="Consolas"/>
-          <w:sz w:val="19"/>
-          <w:szCs w:val="19"/>
-        </w:rPr>
-        <w:t xml:space="preserve"> </w:t>
-      </w:r>
-      <w:proofErr w:type="spellStart"/>
-      <w:proofErr w:type="gramStart"/>
-      <w:r>
-        <w:rPr>
-          <w:rFonts w:ascii="Consolas" w:eastAsia="Consolas" w:hAnsi="Consolas" w:cs="Consolas"/>
-          <w:sz w:val="19"/>
-          <w:szCs w:val="19"/>
-        </w:rPr>
-        <w:t>clave.equals</w:t>
-      </w:r>
-      <w:proofErr w:type="spellEnd"/>
-      <w:proofErr w:type="gramEnd"/>
-      <w:r>
-        <w:rPr>
-          <w:rFonts w:ascii="Consolas" w:eastAsia="Consolas" w:hAnsi="Consolas" w:cs="Consolas"/>
-          <w:sz w:val="19"/>
-          <w:szCs w:val="19"/>
-        </w:rPr>
-        <w:t>(intento)</w:t>
-      </w:r>
-      <w:proofErr w:type="gramStart"/>
-      <w:r>
-        <w:rPr>
-          <w:rFonts w:ascii="Consolas" w:eastAsia="Consolas" w:hAnsi="Consolas" w:cs="Consolas"/>
-          <w:sz w:val="19"/>
-          <w:szCs w:val="19"/>
-        </w:rPr>
-        <w:t>; }</w:t>
-      </w:r>
-      <w:proofErr w:type="gramEnd"/>
-    </w:p>
-    <w:p>
-      <w:pPr>
-        <w:shd w:val="clear" w:color="auto" w:fill="F2F2F2"/>
-      </w:pPr>
-      <w:r>
-        <w:rPr>
-          <w:rFonts w:ascii="Consolas" w:eastAsia="Consolas" w:hAnsi="Consolas" w:cs="Consolas"/>
-          <w:sz w:val="19"/>
-          <w:szCs w:val="19"/>
-        </w:rPr>
-        <w:t xml:space="preserve"> </w:t>
-      </w:r>
-    </w:p>
-    <w:p>
-      <w:pPr>
-        <w:shd w:val="clear" w:color="auto" w:fill="F2F2F2"/>
-      </w:pPr>
-      <w:proofErr w:type="spellStart"/>
-      <w:r>
-        <w:rPr>
-          <w:rFonts w:ascii="Consolas" w:eastAsia="Consolas" w:hAnsi="Consolas" w:cs="Consolas"/>
-          <w:sz w:val="19"/>
-          <w:szCs w:val="19"/>
-        </w:rPr>
-        <w:t>public</w:t>
-      </w:r>
-      <w:proofErr w:type="spellEnd"/>
-      <w:r>
-        <w:rPr>
-          <w:rFonts w:ascii="Consolas" w:eastAsia="Consolas" w:hAnsi="Consolas" w:cs="Consolas"/>
-          <w:sz w:val="19"/>
-          <w:szCs w:val="19"/>
-        </w:rPr>
-        <w:t xml:space="preserve"> </w:t>
-      </w:r>
-      <w:proofErr w:type="spellStart"/>
-      <w:r>
-        <w:rPr>
-          <w:rFonts w:ascii="Consolas" w:eastAsia="Consolas" w:hAnsi="Consolas" w:cs="Consolas"/>
-          <w:sz w:val="19"/>
-          <w:szCs w:val="19"/>
-        </w:rPr>
-        <w:t>boolean</w:t>
-      </w:r>
-      <w:proofErr w:type="spellEnd"/>
-      <w:r>
-        <w:rPr>
-          <w:rFonts w:ascii="Consolas" w:eastAsia="Consolas" w:hAnsi="Consolas" w:cs="Consolas"/>
-          <w:sz w:val="19"/>
-          <w:szCs w:val="19"/>
-        </w:rPr>
-        <w:t xml:space="preserve"> </w:t>
-      </w:r>
-      <w:proofErr w:type="spellStart"/>
-      <w:proofErr w:type="gramStart"/>
-      <w:r>
-        <w:rPr>
-          <w:rFonts w:ascii="Consolas" w:eastAsia="Consolas" w:hAnsi="Consolas" w:cs="Consolas"/>
-          <w:sz w:val="19"/>
-          <w:szCs w:val="19"/>
-        </w:rPr>
-        <w:t>estaSuspendido</w:t>
-      </w:r>
-      <w:proofErr w:type="spellEnd"/>
-      <w:r>
-        <w:rPr>
-          <w:rFonts w:ascii="Consolas" w:eastAsia="Consolas" w:hAnsi="Consolas" w:cs="Consolas"/>
-          <w:sz w:val="19"/>
-          <w:szCs w:val="19"/>
-        </w:rPr>
-        <w:t xml:space="preserve">(){ </w:t>
-      </w:r>
-      <w:proofErr w:type="spellStart"/>
-      <w:r>
-        <w:rPr>
-          <w:rFonts w:ascii="Consolas" w:eastAsia="Consolas" w:hAnsi="Consolas" w:cs="Consolas"/>
-          <w:sz w:val="19"/>
-          <w:szCs w:val="19"/>
-        </w:rPr>
-        <w:t>return</w:t>
-      </w:r>
-      <w:proofErr w:type="spellEnd"/>
-      <w:proofErr w:type="gramEnd"/>
-      <w:r>
-        <w:rPr>
-          <w:rFonts w:ascii="Consolas" w:eastAsia="Consolas" w:hAnsi="Consolas" w:cs="Consolas"/>
-          <w:sz w:val="19"/>
-          <w:szCs w:val="19"/>
-        </w:rPr>
-        <w:t xml:space="preserve"> suspendido</w:t>
-      </w:r>
-      <w:proofErr w:type="gramStart"/>
-      <w:r>
-        <w:rPr>
-          <w:rFonts w:ascii="Consolas" w:eastAsia="Consolas" w:hAnsi="Consolas" w:cs="Consolas"/>
-          <w:sz w:val="19"/>
-          <w:szCs w:val="19"/>
-        </w:rPr>
-        <w:t>; }</w:t>
-      </w:r>
-      <w:proofErr w:type="gramEnd"/>
-    </w:p>
-    <w:p>
-      <w:pPr>
-        <w:pBdr>
-          <w:bottom w:val="single" w:sz="4" w:space="0" w:color="CCCCCC"/>
-        </w:pBdr>
-        <w:shd w:val="clear" w:color="auto" w:fill="F2F2F2"/>
-        <w:spacing w:after="200"/>
-      </w:pPr>
-      <w:r>
-        <w:rPr>
-          <w:rFonts w:ascii="Consolas" w:eastAsia="Consolas" w:hAnsi="Consolas" w:cs="Consolas"/>
-          <w:sz w:val="19"/>
-          <w:szCs w:val="19"/>
-        </w:rPr>
-        <w:t xml:space="preserve"> </w:t>
+      <w:bookmarkEnd w:id="11"/>
+    </w:p>
+    <w:bookmarkStart w:id="12" w:name="_MON_1851072213"/>
+    <w:bookmarkEnd w:id="12"/>
+    <w:p>
+      <w:r>
+        <w:object w:dxaOrig="12240" w:dyaOrig="1140" w14:anchorId="75AD08CA">
+          <v:shape id="_x0000_i1044" type="#_x0000_t75" style="width:540pt;height:50.2pt" o:ole="">
+            <v:imagedata r:id="rId17" o:title=""/>
+          </v:shape>
+          <o:OLEObject Type="Embed" ProgID="Word.OpenDocumentText.12" ShapeID="_x0000_i1044" DrawAspect="Content" ObjectID="_1851072667" r:id="rId18"/>
+        </w:object>
       </w:r>
     </w:p>
     <w:p>
@@ -3247,79 +2495,7 @@
         <w:rPr>
           <w:rFonts w:ascii="Calibri" w:eastAsia="Calibri" w:hAnsi="Calibri" w:cs="Calibri"/>
         </w:rPr>
-        <w:t xml:space="preserve">En Doctor separé la información en dos bloques: la personal (nombre y teléfono) y la de trabajo (número de empleado, usuario, clave y estado de suspensión). La clave es el dato más delicado, así que decidí no darle </w:t>
-      </w:r>
-      <w:proofErr w:type="spellStart"/>
-      <w:r>
-        <w:rPr>
-          <w:rFonts w:ascii="Calibri" w:eastAsia="Calibri" w:hAnsi="Calibri" w:cs="Calibri"/>
-        </w:rPr>
-        <w:t>getter</w:t>
-      </w:r>
-      <w:proofErr w:type="spellEnd"/>
-      <w:r>
-        <w:rPr>
-          <w:rFonts w:ascii="Calibri" w:eastAsia="Calibri" w:hAnsi="Calibri" w:cs="Calibri"/>
-        </w:rPr>
-        <w:t xml:space="preserve">: la única forma de usarla desde fuera es </w:t>
-      </w:r>
-      <w:proofErr w:type="spellStart"/>
-      <w:proofErr w:type="gramStart"/>
-      <w:r>
-        <w:rPr>
-          <w:rFonts w:ascii="Calibri" w:eastAsia="Calibri" w:hAnsi="Calibri" w:cs="Calibri"/>
-        </w:rPr>
-        <w:t>verificarClave</w:t>
-      </w:r>
-      <w:proofErr w:type="spellEnd"/>
-      <w:r>
-        <w:rPr>
-          <w:rFonts w:ascii="Calibri" w:eastAsia="Calibri" w:hAnsi="Calibri" w:cs="Calibri"/>
-        </w:rPr>
-        <w:t>(</w:t>
-      </w:r>
-      <w:proofErr w:type="gramEnd"/>
-      <w:r>
-        <w:rPr>
-          <w:rFonts w:ascii="Calibri" w:eastAsia="Calibri" w:hAnsi="Calibri" w:cs="Calibri"/>
-        </w:rPr>
-        <w:t xml:space="preserve">), que recibe el intento y responde verdadero o falso, de manera que la contraseña nunca sale del objeto. </w:t>
-      </w:r>
-      <w:proofErr w:type="spellStart"/>
-      <w:proofErr w:type="gramStart"/>
-      <w:r>
-        <w:rPr>
-          <w:rFonts w:ascii="Calibri" w:eastAsia="Calibri" w:hAnsi="Calibri" w:cs="Calibri"/>
-        </w:rPr>
-        <w:t>estaSuspendido</w:t>
-      </w:r>
-      <w:proofErr w:type="spellEnd"/>
-      <w:r>
-        <w:rPr>
-          <w:rFonts w:ascii="Calibri" w:eastAsia="Calibri" w:hAnsi="Calibri" w:cs="Calibri"/>
-        </w:rPr>
-        <w:t>(</w:t>
-      </w:r>
-      <w:proofErr w:type="gramEnd"/>
-      <w:r>
-        <w:rPr>
-          <w:rFonts w:ascii="Calibri" w:eastAsia="Calibri" w:hAnsi="Calibri" w:cs="Calibri"/>
-        </w:rPr>
-        <w:t xml:space="preserve">) funciona como candado y lo consulta la Veterinaria antes de permitir cualquier operación. En este mismo objeto vive el arreglo </w:t>
-      </w:r>
-      <w:proofErr w:type="spellStart"/>
-      <w:r>
-        <w:rPr>
-          <w:rFonts w:ascii="Calibri" w:eastAsia="Calibri" w:hAnsi="Calibri" w:cs="Calibri"/>
-        </w:rPr>
-        <w:t>mascotasAtendidas</w:t>
-      </w:r>
-      <w:proofErr w:type="spellEnd"/>
-      <w:r>
-        <w:rPr>
-          <w:rFonts w:ascii="Calibri" w:eastAsia="Calibri" w:hAnsi="Calibri" w:cs="Calibri"/>
-        </w:rPr>
-        <w:t>, que es donde queda registrada la asociación con Mascota.</w:t>
+        <w:t>En Doctor separé la información en dos bloques: la personal (nombre y teléfono) y la de trabajo (número de empleado, usuario, clave y estado de suspensión). La clave es el dato más delicado, así que decidí no darle getter: la única forma de usarla desde fuera es verificarClave(), que recibe el intento y responde verdadero o falso, de manera que la contraseña nunca sale del objeto. estaSuspendido() funciona como candado y lo consulta la Veterinaria antes de permitir cualquier operación. En este mismo objeto vive el arreglo mascotasAtendidas, que es donde queda registrada la asociación con Mascota.</w:t>
       </w:r>
     </w:p>
     <w:p>
@@ -3349,7 +2525,7 @@
                     <pic:cNvPicPr/>
                   </pic:nvPicPr>
                   <pic:blipFill>
-                    <a:blip r:embed="rId15"/>
+                    <a:blip r:embed="rId19"/>
                     <a:stretch>
                       <a:fillRect/>
                     </a:stretch>
@@ -3407,247 +2583,32 @@
       <w:pPr>
         <w:pStyle w:val="Ttulo3"/>
         <w:spacing w:before="240" w:after="120"/>
-      </w:pPr>
-      <w:bookmarkStart w:id="11" w:name="_Toc239939360"/>
-      <w:r>
         <w:rPr>
           <w:rFonts w:ascii="Calibri" w:eastAsia="Calibri" w:hAnsi="Calibri" w:cs="Calibri"/>
         </w:rPr>
+      </w:pPr>
+      <w:bookmarkStart w:id="13" w:name="_Toc239939360"/>
+      <w:r>
+        <w:rPr>
+          <w:rFonts w:ascii="Calibri" w:eastAsia="Calibri" w:hAnsi="Calibri" w:cs="Calibri"/>
+        </w:rPr>
         <w:t>Clase Veterinaria</w:t>
       </w:r>
-      <w:bookmarkEnd w:id="11"/>
-    </w:p>
-    <w:p>
-      <w:pPr>
-        <w:pBdr>
-          <w:top w:val="single" w:sz="4" w:space="0" w:color="CCCCCC"/>
-        </w:pBdr>
-        <w:shd w:val="clear" w:color="auto" w:fill="F2F2F2"/>
-      </w:pPr>
-      <w:proofErr w:type="spellStart"/>
-      <w:r>
-        <w:rPr>
-          <w:rFonts w:ascii="Consolas" w:eastAsia="Consolas" w:hAnsi="Consolas" w:cs="Consolas"/>
-          <w:sz w:val="19"/>
-          <w:szCs w:val="19"/>
-        </w:rPr>
-        <w:t>public</w:t>
-      </w:r>
-      <w:proofErr w:type="spellEnd"/>
-      <w:r>
-        <w:rPr>
-          <w:rFonts w:ascii="Consolas" w:eastAsia="Consolas" w:hAnsi="Consolas" w:cs="Consolas"/>
-          <w:sz w:val="19"/>
-          <w:szCs w:val="19"/>
-        </w:rPr>
-        <w:t xml:space="preserve"> </w:t>
-      </w:r>
-      <w:proofErr w:type="spellStart"/>
-      <w:r>
-        <w:rPr>
-          <w:rFonts w:ascii="Consolas" w:eastAsia="Consolas" w:hAnsi="Consolas" w:cs="Consolas"/>
-          <w:sz w:val="19"/>
-          <w:szCs w:val="19"/>
-        </w:rPr>
-        <w:t>boolean</w:t>
-      </w:r>
-      <w:proofErr w:type="spellEnd"/>
-      <w:r>
-        <w:rPr>
-          <w:rFonts w:ascii="Consolas" w:eastAsia="Consolas" w:hAnsi="Consolas" w:cs="Consolas"/>
-          <w:sz w:val="19"/>
-          <w:szCs w:val="19"/>
-        </w:rPr>
-        <w:t xml:space="preserve"> </w:t>
-      </w:r>
-      <w:proofErr w:type="spellStart"/>
-      <w:proofErr w:type="gramStart"/>
-      <w:r>
-        <w:rPr>
-          <w:rFonts w:ascii="Consolas" w:eastAsia="Consolas" w:hAnsi="Consolas" w:cs="Consolas"/>
-          <w:sz w:val="19"/>
-          <w:szCs w:val="19"/>
-        </w:rPr>
-        <w:t>haySesionDoctor</w:t>
-      </w:r>
-      <w:proofErr w:type="spellEnd"/>
-      <w:r>
-        <w:rPr>
-          <w:rFonts w:ascii="Consolas" w:eastAsia="Consolas" w:hAnsi="Consolas" w:cs="Consolas"/>
-          <w:sz w:val="19"/>
-          <w:szCs w:val="19"/>
-        </w:rPr>
-        <w:t xml:space="preserve">(){ </w:t>
-      </w:r>
-      <w:proofErr w:type="spellStart"/>
-      <w:r>
-        <w:rPr>
-          <w:rFonts w:ascii="Consolas" w:eastAsia="Consolas" w:hAnsi="Consolas" w:cs="Consolas"/>
-          <w:sz w:val="19"/>
-          <w:szCs w:val="19"/>
-        </w:rPr>
-        <w:t>return</w:t>
-      </w:r>
-      <w:proofErr w:type="spellEnd"/>
-      <w:proofErr w:type="gramEnd"/>
-      <w:r>
-        <w:rPr>
-          <w:rFonts w:ascii="Consolas" w:eastAsia="Consolas" w:hAnsi="Consolas" w:cs="Consolas"/>
-          <w:sz w:val="19"/>
-          <w:szCs w:val="19"/>
-        </w:rPr>
-        <w:t xml:space="preserve"> </w:t>
-      </w:r>
-      <w:proofErr w:type="spellStart"/>
-      <w:proofErr w:type="gramStart"/>
-      <w:r>
-        <w:rPr>
-          <w:rFonts w:ascii="Consolas" w:eastAsia="Consolas" w:hAnsi="Consolas" w:cs="Consolas"/>
-          <w:sz w:val="19"/>
-          <w:szCs w:val="19"/>
-        </w:rPr>
-        <w:t>doctorActual</w:t>
-      </w:r>
-      <w:proofErr w:type="spellEnd"/>
-      <w:r>
-        <w:rPr>
-          <w:rFonts w:ascii="Consolas" w:eastAsia="Consolas" w:hAnsi="Consolas" w:cs="Consolas"/>
-          <w:sz w:val="19"/>
-          <w:szCs w:val="19"/>
-        </w:rPr>
-        <w:t xml:space="preserve"> !</w:t>
-      </w:r>
-      <w:proofErr w:type="gramEnd"/>
-      <w:r>
-        <w:rPr>
-          <w:rFonts w:ascii="Consolas" w:eastAsia="Consolas" w:hAnsi="Consolas" w:cs="Consolas"/>
-          <w:sz w:val="19"/>
-          <w:szCs w:val="19"/>
-        </w:rPr>
-        <w:t xml:space="preserve">= </w:t>
-      </w:r>
-      <w:proofErr w:type="spellStart"/>
-      <w:r>
-        <w:rPr>
-          <w:rFonts w:ascii="Consolas" w:eastAsia="Consolas" w:hAnsi="Consolas" w:cs="Consolas"/>
-          <w:sz w:val="19"/>
-          <w:szCs w:val="19"/>
-        </w:rPr>
-        <w:t>null</w:t>
-      </w:r>
-      <w:proofErr w:type="spellEnd"/>
-      <w:proofErr w:type="gramStart"/>
-      <w:r>
-        <w:rPr>
-          <w:rFonts w:ascii="Consolas" w:eastAsia="Consolas" w:hAnsi="Consolas" w:cs="Consolas"/>
-          <w:sz w:val="19"/>
-          <w:szCs w:val="19"/>
-        </w:rPr>
-        <w:t>; }</w:t>
-      </w:r>
-      <w:proofErr w:type="gramEnd"/>
-    </w:p>
-    <w:p>
-      <w:pPr>
-        <w:shd w:val="clear" w:color="auto" w:fill="F2F2F2"/>
-      </w:pPr>
-      <w:r>
-        <w:rPr>
-          <w:rFonts w:ascii="Consolas" w:eastAsia="Consolas" w:hAnsi="Consolas" w:cs="Consolas"/>
-          <w:sz w:val="19"/>
-          <w:szCs w:val="19"/>
-        </w:rPr>
-        <w:t xml:space="preserve"> </w:t>
-      </w:r>
-    </w:p>
-    <w:p>
-      <w:pPr>
-        <w:shd w:val="clear" w:color="auto" w:fill="F2F2F2"/>
-      </w:pPr>
-      <w:proofErr w:type="spellStart"/>
-      <w:proofErr w:type="gramStart"/>
-      <w:r>
-        <w:rPr>
-          <w:rFonts w:ascii="Consolas" w:eastAsia="Consolas" w:hAnsi="Consolas" w:cs="Consolas"/>
-          <w:sz w:val="19"/>
-          <w:szCs w:val="19"/>
-        </w:rPr>
-        <w:t>mascota.setDiagnostico</w:t>
-      </w:r>
-      <w:proofErr w:type="spellEnd"/>
-      <w:proofErr w:type="gramEnd"/>
-      <w:r>
-        <w:rPr>
-          <w:rFonts w:ascii="Consolas" w:eastAsia="Consolas" w:hAnsi="Consolas" w:cs="Consolas"/>
-          <w:sz w:val="19"/>
-          <w:szCs w:val="19"/>
-        </w:rPr>
-        <w:t>(diagnostico);</w:t>
-      </w:r>
-    </w:p>
-    <w:p>
-      <w:pPr>
-        <w:shd w:val="clear" w:color="auto" w:fill="F2F2F2"/>
-      </w:pPr>
-      <w:proofErr w:type="spellStart"/>
-      <w:r>
-        <w:rPr>
-          <w:rFonts w:ascii="Consolas" w:eastAsia="Consolas" w:hAnsi="Consolas" w:cs="Consolas"/>
-          <w:sz w:val="19"/>
-          <w:szCs w:val="19"/>
-        </w:rPr>
-        <w:t>doctorActual.registrarAtencion</w:t>
-      </w:r>
-      <w:proofErr w:type="spellEnd"/>
-      <w:r>
-        <w:rPr>
-          <w:rFonts w:ascii="Consolas" w:eastAsia="Consolas" w:hAnsi="Consolas" w:cs="Consolas"/>
-          <w:sz w:val="19"/>
-          <w:szCs w:val="19"/>
-        </w:rPr>
-        <w:t>(mascota);</w:t>
-      </w:r>
-    </w:p>
-    <w:p>
-      <w:pPr>
-        <w:shd w:val="clear" w:color="auto" w:fill="F2F2F2"/>
-      </w:pPr>
-      <w:proofErr w:type="spellStart"/>
-      <w:r>
-        <w:rPr>
-          <w:rFonts w:ascii="Consolas" w:eastAsia="Consolas" w:hAnsi="Consolas" w:cs="Consolas"/>
-          <w:sz w:val="19"/>
-          <w:szCs w:val="19"/>
-        </w:rPr>
-        <w:t>return</w:t>
-      </w:r>
-      <w:proofErr w:type="spellEnd"/>
-      <w:r>
-        <w:rPr>
-          <w:rFonts w:ascii="Consolas" w:eastAsia="Consolas" w:hAnsi="Consolas" w:cs="Consolas"/>
-          <w:sz w:val="19"/>
-          <w:szCs w:val="19"/>
-        </w:rPr>
-        <w:t xml:space="preserve"> true;</w:t>
-      </w:r>
-    </w:p>
-    <w:p>
-      <w:pPr>
-        <w:pBdr>
-          <w:bottom w:val="single" w:sz="4" w:space="0" w:color="CCCCCC"/>
-        </w:pBdr>
-        <w:shd w:val="clear" w:color="auto" w:fill="F2F2F2"/>
-        <w:spacing w:after="200"/>
-      </w:pPr>
-      <w:r>
-        <w:rPr>
-          <w:rFonts w:ascii="Consolas" w:eastAsia="Consolas" w:hAnsi="Consolas" w:cs="Consolas"/>
-          <w:sz w:val="19"/>
-          <w:szCs w:val="19"/>
-        </w:rPr>
-        <w:t xml:space="preserve"> </w:t>
-      </w:r>
-    </w:p>
+      <w:bookmarkEnd w:id="13"/>
+    </w:p>
+    <w:bookmarkStart w:id="14" w:name="_MON_1851072363"/>
+    <w:bookmarkEnd w:id="14"/>
+    <w:p>
+      <w:r>
+        <w:object w:dxaOrig="12240" w:dyaOrig="5165" w14:anchorId="17E8B605">
+          <v:shape id="_x0000_i1052" type="#_x0000_t75" style="width:540pt;height:228pt" o:ole="">
+            <v:imagedata r:id="rId20" o:title=""/>
+          </v:shape>
+          <o:OLEObject Type="Embed" ProgID="Word.OpenDocumentText.12" ShapeID="_x0000_i1052" DrawAspect="Content" ObjectID="_1851072668" r:id="rId21"/>
+        </w:object>
+      </w:r>
+    </w:p>
+    <w:p/>
     <w:p>
       <w:pPr>
         <w:spacing w:after="160"/>
@@ -3660,29 +2621,7 @@
         <w:rPr>
           <w:rFonts w:ascii="Calibri" w:eastAsia="Calibri" w:hAnsi="Calibri" w:cs="Calibri"/>
         </w:rPr>
-        <w:t xml:space="preserve">Estas líneas del método </w:t>
-      </w:r>
-      <w:proofErr w:type="spellStart"/>
-      <w:proofErr w:type="gramStart"/>
-      <w:r>
-        <w:rPr>
-          <w:rFonts w:ascii="Calibri" w:eastAsia="Calibri" w:hAnsi="Calibri" w:cs="Calibri"/>
-        </w:rPr>
-        <w:t>darDiagnostico</w:t>
-      </w:r>
-      <w:proofErr w:type="spellEnd"/>
-      <w:r>
-        <w:rPr>
-          <w:rFonts w:ascii="Calibri" w:eastAsia="Calibri" w:hAnsi="Calibri" w:cs="Calibri"/>
-        </w:rPr>
-        <w:t>(</w:t>
-      </w:r>
-      <w:proofErr w:type="gramEnd"/>
-      <w:r>
-        <w:rPr>
-          <w:rFonts w:ascii="Calibri" w:eastAsia="Calibri" w:hAnsi="Calibri" w:cs="Calibri"/>
-        </w:rPr>
-        <w:t>) son el centro de la práctica, porque en ellas conviven los dos tipos de relación. La primera modifica una Mascota que la propia Veterinaria creó y tiene guardada en su arreglo, que es la parte de composición. La segunda le avisa al doctor que tiene la sesión abierta para que anote esa misma mascota en su historial, y ahí aparece la asociación: el doctor termina apuntando al mismo objeto Mascota sin haberlo creado y sin poder destruirlo. Preferí guardar el objeto y no solamente su id, porque así el doctor puede consultar su historial por su cuenta sin depender de la veterinaria para resolver cada id.</w:t>
+        <w:t>Estas líneas del método darDiagnostico() son el centro de la práctica, porque en ellas conviven los dos tipos de relación. La primera modifica una Mascota que la propia Veterinaria creó y tiene guardada en su arreglo, que es la parte de composición. La segunda le avisa al doctor que tiene la sesión abierta para que anote esa misma mascota en su historial, y ahí aparece la asociación: el doctor termina apuntando al mismo objeto Mascota sin haberlo creado y sin poder destruirlo. Preferí guardar el objeto y no solamente su id, porque así el doctor puede consultar su historial por su cuenta sin depender de la veterinaria para resolver cada id.</w:t>
       </w:r>
     </w:p>
     <w:p>
@@ -3712,7 +2651,7 @@
                     <pic:cNvPicPr/>
                   </pic:nvPicPr>
                   <pic:blipFill>
-                    <a:blip r:embed="rId16"/>
+                    <a:blip r:embed="rId22"/>
                     <a:stretch>
                       <a:fillRect/>
                     </a:stretch>
@@ -3770,640 +2709,29 @@
       <w:pPr>
         <w:pStyle w:val="Ttulo3"/>
         <w:spacing w:before="240" w:after="120"/>
-      </w:pPr>
-      <w:bookmarkStart w:id="12" w:name="_Toc239939361"/>
-      <w:r>
         <w:rPr>
           <w:rFonts w:ascii="Calibri" w:eastAsia="Calibri" w:hAnsi="Calibri" w:cs="Calibri"/>
         </w:rPr>
+      </w:pPr>
+      <w:bookmarkStart w:id="15" w:name="_Toc239939361"/>
+      <w:r>
+        <w:rPr>
+          <w:rFonts w:ascii="Calibri" w:eastAsia="Calibri" w:hAnsi="Calibri" w:cs="Calibri"/>
+        </w:rPr>
         <w:t>Clase Main — menú principal y control de sesión</w:t>
       </w:r>
-      <w:bookmarkEnd w:id="12"/>
-    </w:p>
-    <w:p>
-      <w:pPr>
-        <w:pBdr>
-          <w:top w:val="single" w:sz="4" w:space="0" w:color="CCCCCC"/>
-        </w:pBdr>
-        <w:shd w:val="clear" w:color="auto" w:fill="F2F2F2"/>
-      </w:pPr>
-      <w:proofErr w:type="spellStart"/>
-      <w:r>
-        <w:rPr>
-          <w:rFonts w:ascii="Consolas" w:eastAsia="Consolas" w:hAnsi="Consolas" w:cs="Consolas"/>
-          <w:sz w:val="19"/>
-          <w:szCs w:val="19"/>
-        </w:rPr>
-        <w:t>public</w:t>
-      </w:r>
-      <w:proofErr w:type="spellEnd"/>
-      <w:r>
-        <w:rPr>
-          <w:rFonts w:ascii="Consolas" w:eastAsia="Consolas" w:hAnsi="Consolas" w:cs="Consolas"/>
-          <w:sz w:val="19"/>
-          <w:szCs w:val="19"/>
-        </w:rPr>
-        <w:t xml:space="preserve"> </w:t>
-      </w:r>
-      <w:proofErr w:type="spellStart"/>
-      <w:r>
-        <w:rPr>
-          <w:rFonts w:ascii="Consolas" w:eastAsia="Consolas" w:hAnsi="Consolas" w:cs="Consolas"/>
-          <w:sz w:val="19"/>
-          <w:szCs w:val="19"/>
-        </w:rPr>
-        <w:t>static</w:t>
-      </w:r>
-      <w:proofErr w:type="spellEnd"/>
-      <w:r>
-        <w:rPr>
-          <w:rFonts w:ascii="Consolas" w:eastAsia="Consolas" w:hAnsi="Consolas" w:cs="Consolas"/>
-          <w:sz w:val="19"/>
-          <w:szCs w:val="19"/>
-        </w:rPr>
-        <w:t xml:space="preserve"> </w:t>
-      </w:r>
-      <w:proofErr w:type="spellStart"/>
-      <w:r>
-        <w:rPr>
-          <w:rFonts w:ascii="Consolas" w:eastAsia="Consolas" w:hAnsi="Consolas" w:cs="Consolas"/>
-          <w:sz w:val="19"/>
-          <w:szCs w:val="19"/>
-        </w:rPr>
-        <w:t>void</w:t>
-      </w:r>
-      <w:proofErr w:type="spellEnd"/>
-      <w:r>
-        <w:rPr>
-          <w:rFonts w:ascii="Consolas" w:eastAsia="Consolas" w:hAnsi="Consolas" w:cs="Consolas"/>
-          <w:sz w:val="19"/>
-          <w:szCs w:val="19"/>
-        </w:rPr>
-        <w:t xml:space="preserve"> </w:t>
-      </w:r>
-      <w:proofErr w:type="spellStart"/>
-      <w:proofErr w:type="gramStart"/>
-      <w:r>
-        <w:rPr>
-          <w:rFonts w:ascii="Consolas" w:eastAsia="Consolas" w:hAnsi="Consolas" w:cs="Consolas"/>
-          <w:sz w:val="19"/>
-          <w:szCs w:val="19"/>
-        </w:rPr>
-        <w:t>main</w:t>
-      </w:r>
-      <w:proofErr w:type="spellEnd"/>
-      <w:r>
-        <w:rPr>
-          <w:rFonts w:ascii="Consolas" w:eastAsia="Consolas" w:hAnsi="Consolas" w:cs="Consolas"/>
-          <w:sz w:val="19"/>
-          <w:szCs w:val="19"/>
-        </w:rPr>
-        <w:t>(String[</w:t>
-      </w:r>
-      <w:proofErr w:type="gramEnd"/>
-      <w:r>
-        <w:rPr>
-          <w:rFonts w:ascii="Consolas" w:eastAsia="Consolas" w:hAnsi="Consolas" w:cs="Consolas"/>
-          <w:sz w:val="19"/>
-          <w:szCs w:val="19"/>
-        </w:rPr>
-        <w:t xml:space="preserve">] </w:t>
-      </w:r>
-      <w:proofErr w:type="spellStart"/>
-      <w:proofErr w:type="gramStart"/>
-      <w:r>
-        <w:rPr>
-          <w:rFonts w:ascii="Consolas" w:eastAsia="Consolas" w:hAnsi="Consolas" w:cs="Consolas"/>
-          <w:sz w:val="19"/>
-          <w:szCs w:val="19"/>
-        </w:rPr>
-        <w:t>args</w:t>
-      </w:r>
-      <w:proofErr w:type="spellEnd"/>
-      <w:r>
-        <w:rPr>
-          <w:rFonts w:ascii="Consolas" w:eastAsia="Consolas" w:hAnsi="Consolas" w:cs="Consolas"/>
-          <w:sz w:val="19"/>
-          <w:szCs w:val="19"/>
-        </w:rPr>
-        <w:t>){</w:t>
-      </w:r>
-      <w:proofErr w:type="gramEnd"/>
-    </w:p>
-    <w:p>
-      <w:pPr>
-        <w:shd w:val="clear" w:color="auto" w:fill="F2F2F2"/>
-      </w:pPr>
-      <w:r>
-        <w:rPr>
-          <w:rFonts w:ascii="Consolas" w:eastAsia="Consolas" w:hAnsi="Consolas" w:cs="Consolas"/>
-          <w:sz w:val="19"/>
-          <w:szCs w:val="19"/>
-        </w:rPr>
-        <w:t xml:space="preserve">  int </w:t>
-      </w:r>
-      <w:proofErr w:type="spellStart"/>
-      <w:r>
-        <w:rPr>
-          <w:rFonts w:ascii="Consolas" w:eastAsia="Consolas" w:hAnsi="Consolas" w:cs="Consolas"/>
-          <w:sz w:val="19"/>
-          <w:szCs w:val="19"/>
-        </w:rPr>
-        <w:t>opcion</w:t>
-      </w:r>
-      <w:proofErr w:type="spellEnd"/>
-      <w:r>
-        <w:rPr>
-          <w:rFonts w:ascii="Consolas" w:eastAsia="Consolas" w:hAnsi="Consolas" w:cs="Consolas"/>
-          <w:sz w:val="19"/>
-          <w:szCs w:val="19"/>
-        </w:rPr>
-        <w:t>;</w:t>
-      </w:r>
-    </w:p>
-    <w:p>
-      <w:pPr>
-        <w:shd w:val="clear" w:color="auto" w:fill="F2F2F2"/>
-      </w:pPr>
-      <w:r>
-        <w:rPr>
-          <w:rFonts w:ascii="Consolas" w:eastAsia="Consolas" w:hAnsi="Consolas" w:cs="Consolas"/>
-          <w:sz w:val="19"/>
-          <w:szCs w:val="19"/>
-        </w:rPr>
-        <w:t xml:space="preserve">  </w:t>
-      </w:r>
-      <w:proofErr w:type="gramStart"/>
-      <w:r>
-        <w:rPr>
-          <w:rFonts w:ascii="Consolas" w:eastAsia="Consolas" w:hAnsi="Consolas" w:cs="Consolas"/>
-          <w:sz w:val="19"/>
-          <w:szCs w:val="19"/>
-        </w:rPr>
-        <w:t>do{</w:t>
-      </w:r>
-      <w:proofErr w:type="gramEnd"/>
-    </w:p>
-    <w:p>
-      <w:pPr>
-        <w:shd w:val="clear" w:color="auto" w:fill="F2F2F2"/>
-      </w:pPr>
-      <w:r>
-        <w:rPr>
-          <w:rFonts w:ascii="Consolas" w:eastAsia="Consolas" w:hAnsi="Consolas" w:cs="Consolas"/>
-          <w:sz w:val="19"/>
-          <w:szCs w:val="19"/>
-        </w:rPr>
-        <w:t xml:space="preserve">    </w:t>
-      </w:r>
-      <w:proofErr w:type="spellStart"/>
-      <w:proofErr w:type="gramStart"/>
-      <w:r>
-        <w:rPr>
-          <w:rFonts w:ascii="Consolas" w:eastAsia="Consolas" w:hAnsi="Consolas" w:cs="Consolas"/>
-          <w:sz w:val="19"/>
-          <w:szCs w:val="19"/>
-        </w:rPr>
-        <w:t>imprimirEstadoSesion</w:t>
-      </w:r>
-      <w:proofErr w:type="spellEnd"/>
-      <w:r>
-        <w:rPr>
-          <w:rFonts w:ascii="Consolas" w:eastAsia="Consolas" w:hAnsi="Consolas" w:cs="Consolas"/>
-          <w:sz w:val="19"/>
-          <w:szCs w:val="19"/>
-        </w:rPr>
-        <w:t>(</w:t>
-      </w:r>
-      <w:proofErr w:type="gramEnd"/>
-      <w:r>
-        <w:rPr>
-          <w:rFonts w:ascii="Consolas" w:eastAsia="Consolas" w:hAnsi="Consolas" w:cs="Consolas"/>
-          <w:sz w:val="19"/>
-          <w:szCs w:val="19"/>
-        </w:rPr>
-        <w:t>);</w:t>
-      </w:r>
-    </w:p>
-    <w:p>
-      <w:pPr>
-        <w:shd w:val="clear" w:color="auto" w:fill="F2F2F2"/>
-      </w:pPr>
-      <w:r>
-        <w:rPr>
-          <w:rFonts w:ascii="Consolas" w:eastAsia="Consolas" w:hAnsi="Consolas" w:cs="Consolas"/>
-          <w:sz w:val="19"/>
-          <w:szCs w:val="19"/>
-        </w:rPr>
-        <w:t xml:space="preserve">    // ...imprime el menú principal...</w:t>
-      </w:r>
-    </w:p>
-    <w:p>
-      <w:pPr>
-        <w:shd w:val="clear" w:color="auto" w:fill="F2F2F2"/>
-      </w:pPr>
-      <w:r>
-        <w:rPr>
-          <w:rFonts w:ascii="Consolas" w:eastAsia="Consolas" w:hAnsi="Consolas" w:cs="Consolas"/>
-          <w:sz w:val="19"/>
-          <w:szCs w:val="19"/>
-        </w:rPr>
-        <w:t xml:space="preserve">    </w:t>
-      </w:r>
-      <w:proofErr w:type="spellStart"/>
-      <w:r>
-        <w:rPr>
-          <w:rFonts w:ascii="Consolas" w:eastAsia="Consolas" w:hAnsi="Consolas" w:cs="Consolas"/>
-          <w:sz w:val="19"/>
-          <w:szCs w:val="19"/>
-        </w:rPr>
-        <w:t>opcion</w:t>
-      </w:r>
-      <w:proofErr w:type="spellEnd"/>
-      <w:r>
-        <w:rPr>
-          <w:rFonts w:ascii="Consolas" w:eastAsia="Consolas" w:hAnsi="Consolas" w:cs="Consolas"/>
-          <w:sz w:val="19"/>
-          <w:szCs w:val="19"/>
-        </w:rPr>
-        <w:t xml:space="preserve"> = </w:t>
-      </w:r>
-      <w:proofErr w:type="spellStart"/>
-      <w:proofErr w:type="gramStart"/>
-      <w:r>
-        <w:rPr>
-          <w:rFonts w:ascii="Consolas" w:eastAsia="Consolas" w:hAnsi="Consolas" w:cs="Consolas"/>
-          <w:sz w:val="19"/>
-          <w:szCs w:val="19"/>
-        </w:rPr>
-        <w:t>leerEntero</w:t>
-      </w:r>
-      <w:proofErr w:type="spellEnd"/>
-      <w:r>
-        <w:rPr>
-          <w:rFonts w:ascii="Consolas" w:eastAsia="Consolas" w:hAnsi="Consolas" w:cs="Consolas"/>
-          <w:sz w:val="19"/>
-          <w:szCs w:val="19"/>
-        </w:rPr>
-        <w:t>(</w:t>
-      </w:r>
-      <w:proofErr w:type="gramEnd"/>
-      <w:r>
-        <w:rPr>
-          <w:rFonts w:ascii="Consolas" w:eastAsia="Consolas" w:hAnsi="Consolas" w:cs="Consolas"/>
-          <w:sz w:val="19"/>
-          <w:szCs w:val="19"/>
-        </w:rPr>
-        <w:t>);</w:t>
-      </w:r>
-    </w:p>
-    <w:p>
-      <w:pPr>
-        <w:shd w:val="clear" w:color="auto" w:fill="F2F2F2"/>
-      </w:pPr>
-      <w:r>
-        <w:rPr>
-          <w:rFonts w:ascii="Consolas" w:eastAsia="Consolas" w:hAnsi="Consolas" w:cs="Consolas"/>
-          <w:sz w:val="19"/>
-          <w:szCs w:val="19"/>
-        </w:rPr>
-        <w:t xml:space="preserve">    switch(</w:t>
-      </w:r>
-      <w:proofErr w:type="spellStart"/>
-      <w:r>
-        <w:rPr>
-          <w:rFonts w:ascii="Consolas" w:eastAsia="Consolas" w:hAnsi="Consolas" w:cs="Consolas"/>
-          <w:sz w:val="19"/>
-          <w:szCs w:val="19"/>
-        </w:rPr>
-        <w:t>opcion</w:t>
-      </w:r>
-      <w:proofErr w:type="spellEnd"/>
-      <w:proofErr w:type="gramStart"/>
-      <w:r>
-        <w:rPr>
-          <w:rFonts w:ascii="Consolas" w:eastAsia="Consolas" w:hAnsi="Consolas" w:cs="Consolas"/>
-          <w:sz w:val="19"/>
-          <w:szCs w:val="19"/>
-        </w:rPr>
-        <w:t>){</w:t>
-      </w:r>
-      <w:proofErr w:type="gramEnd"/>
-    </w:p>
-    <w:p>
-      <w:pPr>
-        <w:shd w:val="clear" w:color="auto" w:fill="F2F2F2"/>
-      </w:pPr>
-      <w:r>
-        <w:rPr>
-          <w:rFonts w:ascii="Consolas" w:eastAsia="Consolas" w:hAnsi="Consolas" w:cs="Consolas"/>
-          <w:sz w:val="19"/>
-          <w:szCs w:val="19"/>
-        </w:rPr>
-        <w:t xml:space="preserve">      case 1: </w:t>
-      </w:r>
-      <w:proofErr w:type="spellStart"/>
-      <w:proofErr w:type="gramStart"/>
-      <w:r>
-        <w:rPr>
-          <w:rFonts w:ascii="Consolas" w:eastAsia="Consolas" w:hAnsi="Consolas" w:cs="Consolas"/>
-          <w:sz w:val="19"/>
-          <w:szCs w:val="19"/>
-        </w:rPr>
-        <w:t>loginSuperUsuario</w:t>
-      </w:r>
-      <w:proofErr w:type="spellEnd"/>
-      <w:r>
-        <w:rPr>
-          <w:rFonts w:ascii="Consolas" w:eastAsia="Consolas" w:hAnsi="Consolas" w:cs="Consolas"/>
-          <w:sz w:val="19"/>
-          <w:szCs w:val="19"/>
-        </w:rPr>
-        <w:t>(</w:t>
-      </w:r>
-      <w:proofErr w:type="gramEnd"/>
-      <w:r>
-        <w:rPr>
-          <w:rFonts w:ascii="Consolas" w:eastAsia="Consolas" w:hAnsi="Consolas" w:cs="Consolas"/>
-          <w:sz w:val="19"/>
-          <w:szCs w:val="19"/>
-        </w:rPr>
-        <w:t>); break;</w:t>
-      </w:r>
-    </w:p>
-    <w:p>
-      <w:pPr>
-        <w:shd w:val="clear" w:color="auto" w:fill="F2F2F2"/>
-      </w:pPr>
-      <w:r>
-        <w:rPr>
-          <w:rFonts w:ascii="Consolas" w:eastAsia="Consolas" w:hAnsi="Consolas" w:cs="Consolas"/>
-          <w:sz w:val="19"/>
-          <w:szCs w:val="19"/>
-        </w:rPr>
-        <w:t xml:space="preserve">      case 2: </w:t>
-      </w:r>
-      <w:proofErr w:type="spellStart"/>
-      <w:proofErr w:type="gramStart"/>
-      <w:r>
-        <w:rPr>
-          <w:rFonts w:ascii="Consolas" w:eastAsia="Consolas" w:hAnsi="Consolas" w:cs="Consolas"/>
-          <w:sz w:val="19"/>
-          <w:szCs w:val="19"/>
-        </w:rPr>
-        <w:t>loginDoctor</w:t>
-      </w:r>
-      <w:proofErr w:type="spellEnd"/>
-      <w:r>
-        <w:rPr>
-          <w:rFonts w:ascii="Consolas" w:eastAsia="Consolas" w:hAnsi="Consolas" w:cs="Consolas"/>
-          <w:sz w:val="19"/>
-          <w:szCs w:val="19"/>
-        </w:rPr>
-        <w:t xml:space="preserve">();   </w:t>
-      </w:r>
-      <w:proofErr w:type="gramEnd"/>
-      <w:r>
-        <w:rPr>
-          <w:rFonts w:ascii="Consolas" w:eastAsia="Consolas" w:hAnsi="Consolas" w:cs="Consolas"/>
-          <w:sz w:val="19"/>
-          <w:szCs w:val="19"/>
-        </w:rPr>
-        <w:t xml:space="preserve">    break;</w:t>
-      </w:r>
-    </w:p>
-    <w:p>
-      <w:pPr>
-        <w:shd w:val="clear" w:color="auto" w:fill="F2F2F2"/>
-      </w:pPr>
-      <w:r>
-        <w:rPr>
-          <w:rFonts w:ascii="Consolas" w:eastAsia="Consolas" w:hAnsi="Consolas" w:cs="Consolas"/>
-          <w:sz w:val="19"/>
-          <w:szCs w:val="19"/>
-        </w:rPr>
-        <w:t xml:space="preserve">      case 7: </w:t>
-      </w:r>
-      <w:proofErr w:type="spellStart"/>
-      <w:proofErr w:type="gramStart"/>
-      <w:r>
-        <w:rPr>
-          <w:rFonts w:ascii="Consolas" w:eastAsia="Consolas" w:hAnsi="Consolas" w:cs="Consolas"/>
-          <w:sz w:val="19"/>
-          <w:szCs w:val="19"/>
-        </w:rPr>
-        <w:t>darDeAltaMascota</w:t>
-      </w:r>
-      <w:proofErr w:type="spellEnd"/>
-      <w:r>
-        <w:rPr>
-          <w:rFonts w:ascii="Consolas" w:eastAsia="Consolas" w:hAnsi="Consolas" w:cs="Consolas"/>
-          <w:sz w:val="19"/>
-          <w:szCs w:val="19"/>
-        </w:rPr>
-        <w:t>();  break</w:t>
-      </w:r>
-      <w:proofErr w:type="gramEnd"/>
-      <w:r>
-        <w:rPr>
-          <w:rFonts w:ascii="Consolas" w:eastAsia="Consolas" w:hAnsi="Consolas" w:cs="Consolas"/>
-          <w:sz w:val="19"/>
-          <w:szCs w:val="19"/>
-        </w:rPr>
-        <w:t>;</w:t>
-      </w:r>
-    </w:p>
-    <w:p>
-      <w:pPr>
-        <w:shd w:val="clear" w:color="auto" w:fill="F2F2F2"/>
-      </w:pPr>
-      <w:r>
-        <w:rPr>
-          <w:rFonts w:ascii="Consolas" w:eastAsia="Consolas" w:hAnsi="Consolas" w:cs="Consolas"/>
-          <w:sz w:val="19"/>
-          <w:szCs w:val="19"/>
-        </w:rPr>
-        <w:t xml:space="preserve">      case 9: </w:t>
-      </w:r>
-      <w:proofErr w:type="spellStart"/>
-      <w:proofErr w:type="gramStart"/>
-      <w:r>
-        <w:rPr>
-          <w:rFonts w:ascii="Consolas" w:eastAsia="Consolas" w:hAnsi="Consolas" w:cs="Consolas"/>
-          <w:sz w:val="19"/>
-          <w:szCs w:val="19"/>
-        </w:rPr>
-        <w:t>darDiagnostico</w:t>
-      </w:r>
-      <w:proofErr w:type="spellEnd"/>
-      <w:r>
-        <w:rPr>
-          <w:rFonts w:ascii="Consolas" w:eastAsia="Consolas" w:hAnsi="Consolas" w:cs="Consolas"/>
-          <w:sz w:val="19"/>
-          <w:szCs w:val="19"/>
-        </w:rPr>
-        <w:t xml:space="preserve">();   </w:t>
-      </w:r>
-      <w:proofErr w:type="gramEnd"/>
-      <w:r>
-        <w:rPr>
-          <w:rFonts w:ascii="Consolas" w:eastAsia="Consolas" w:hAnsi="Consolas" w:cs="Consolas"/>
-          <w:sz w:val="19"/>
-          <w:szCs w:val="19"/>
-        </w:rPr>
-        <w:t xml:space="preserve"> break;</w:t>
-      </w:r>
-    </w:p>
-    <w:p>
-      <w:pPr>
-        <w:shd w:val="clear" w:color="auto" w:fill="F2F2F2"/>
-      </w:pPr>
-      <w:r>
-        <w:rPr>
-          <w:rFonts w:ascii="Consolas" w:eastAsia="Consolas" w:hAnsi="Consolas" w:cs="Consolas"/>
-          <w:sz w:val="19"/>
-          <w:szCs w:val="19"/>
-        </w:rPr>
-        <w:t xml:space="preserve">      case 0: </w:t>
-      </w:r>
-      <w:proofErr w:type="spellStart"/>
-      <w:r>
-        <w:rPr>
-          <w:rFonts w:ascii="Consolas" w:eastAsia="Consolas" w:hAnsi="Consolas" w:cs="Consolas"/>
-          <w:sz w:val="19"/>
-          <w:szCs w:val="19"/>
-        </w:rPr>
-        <w:t>System.out.println</w:t>
-      </w:r>
-      <w:proofErr w:type="spellEnd"/>
-      <w:r>
-        <w:rPr>
-          <w:rFonts w:ascii="Consolas" w:eastAsia="Consolas" w:hAnsi="Consolas" w:cs="Consolas"/>
-          <w:sz w:val="19"/>
-          <w:szCs w:val="19"/>
-        </w:rPr>
-        <w:t>("Saliendo del programa..."); break;</w:t>
-      </w:r>
-    </w:p>
-    <w:p>
-      <w:pPr>
-        <w:shd w:val="clear" w:color="auto" w:fill="F2F2F2"/>
-      </w:pPr>
-      <w:r>
-        <w:rPr>
-          <w:rFonts w:ascii="Consolas" w:eastAsia="Consolas" w:hAnsi="Consolas" w:cs="Consolas"/>
-          <w:sz w:val="19"/>
-          <w:szCs w:val="19"/>
-        </w:rPr>
-        <w:t xml:space="preserve">      default: </w:t>
-      </w:r>
-      <w:proofErr w:type="spellStart"/>
-      <w:r>
-        <w:rPr>
-          <w:rFonts w:ascii="Consolas" w:eastAsia="Consolas" w:hAnsi="Consolas" w:cs="Consolas"/>
-          <w:sz w:val="19"/>
-          <w:szCs w:val="19"/>
-        </w:rPr>
-        <w:t>System.out.println</w:t>
-      </w:r>
-      <w:proofErr w:type="spellEnd"/>
-      <w:r>
-        <w:rPr>
-          <w:rFonts w:ascii="Consolas" w:eastAsia="Consolas" w:hAnsi="Consolas" w:cs="Consolas"/>
-          <w:sz w:val="19"/>
-          <w:szCs w:val="19"/>
-        </w:rPr>
-        <w:t>("</w:t>
-      </w:r>
-      <w:proofErr w:type="spellStart"/>
-      <w:r>
-        <w:rPr>
-          <w:rFonts w:ascii="Consolas" w:eastAsia="Consolas" w:hAnsi="Consolas" w:cs="Consolas"/>
-          <w:sz w:val="19"/>
-          <w:szCs w:val="19"/>
-        </w:rPr>
-        <w:t>Opcion</w:t>
-      </w:r>
-      <w:proofErr w:type="spellEnd"/>
-      <w:r>
-        <w:rPr>
-          <w:rFonts w:ascii="Consolas" w:eastAsia="Consolas" w:hAnsi="Consolas" w:cs="Consolas"/>
-          <w:sz w:val="19"/>
-          <w:szCs w:val="19"/>
-        </w:rPr>
-        <w:t xml:space="preserve"> no valida, intente de nuevo.");</w:t>
-      </w:r>
-    </w:p>
-    <w:p>
-      <w:pPr>
-        <w:shd w:val="clear" w:color="auto" w:fill="F2F2F2"/>
-      </w:pPr>
-      <w:r>
-        <w:rPr>
-          <w:rFonts w:ascii="Consolas" w:eastAsia="Consolas" w:hAnsi="Consolas" w:cs="Consolas"/>
-          <w:sz w:val="19"/>
-          <w:szCs w:val="19"/>
-        </w:rPr>
-        <w:t xml:space="preserve">    }</w:t>
-      </w:r>
-    </w:p>
-    <w:p>
-      <w:pPr>
-        <w:shd w:val="clear" w:color="auto" w:fill="F2F2F2"/>
-      </w:pPr>
-      <w:r>
-        <w:rPr>
-          <w:rFonts w:ascii="Consolas" w:eastAsia="Consolas" w:hAnsi="Consolas" w:cs="Consolas"/>
-          <w:sz w:val="19"/>
-          <w:szCs w:val="19"/>
-        </w:rPr>
-        <w:t xml:space="preserve">  } </w:t>
-      </w:r>
-      <w:proofErr w:type="spellStart"/>
-      <w:proofErr w:type="gramStart"/>
-      <w:r>
-        <w:rPr>
-          <w:rFonts w:ascii="Consolas" w:eastAsia="Consolas" w:hAnsi="Consolas" w:cs="Consolas"/>
-          <w:sz w:val="19"/>
-          <w:szCs w:val="19"/>
-        </w:rPr>
-        <w:t>while</w:t>
-      </w:r>
-      <w:proofErr w:type="spellEnd"/>
-      <w:r>
-        <w:rPr>
-          <w:rFonts w:ascii="Consolas" w:eastAsia="Consolas" w:hAnsi="Consolas" w:cs="Consolas"/>
-          <w:sz w:val="19"/>
-          <w:szCs w:val="19"/>
-        </w:rPr>
-        <w:t>(</w:t>
-      </w:r>
-      <w:proofErr w:type="spellStart"/>
-      <w:r>
-        <w:rPr>
-          <w:rFonts w:ascii="Consolas" w:eastAsia="Consolas" w:hAnsi="Consolas" w:cs="Consolas"/>
-          <w:sz w:val="19"/>
-          <w:szCs w:val="19"/>
-        </w:rPr>
-        <w:t>opcion</w:t>
-      </w:r>
-      <w:proofErr w:type="spellEnd"/>
-      <w:r>
-        <w:rPr>
-          <w:rFonts w:ascii="Consolas" w:eastAsia="Consolas" w:hAnsi="Consolas" w:cs="Consolas"/>
-          <w:sz w:val="19"/>
-          <w:szCs w:val="19"/>
-        </w:rPr>
-        <w:t xml:space="preserve"> !</w:t>
-      </w:r>
-      <w:proofErr w:type="gramEnd"/>
-      <w:r>
-        <w:rPr>
-          <w:rFonts w:ascii="Consolas" w:eastAsia="Consolas" w:hAnsi="Consolas" w:cs="Consolas"/>
-          <w:sz w:val="19"/>
-          <w:szCs w:val="19"/>
-        </w:rPr>
-        <w:t>= 0);</w:t>
+      <w:bookmarkEnd w:id="15"/>
+    </w:p>
+    <w:bookmarkStart w:id="16" w:name="_MON_1851072568"/>
+    <w:bookmarkEnd w:id="16"/>
+    <w:p>
+      <w:r>
+        <w:object w:dxaOrig="12240" w:dyaOrig="4275" w14:anchorId="1D3BFF21">
+          <v:shape id="_x0000_i1057" type="#_x0000_t75" style="width:540pt;height:188.75pt" o:ole="">
+            <v:imagedata r:id="rId23" o:title=""/>
+          </v:shape>
+          <o:OLEObject Type="Embed" ProgID="Word.OpenDocumentText.12" ShapeID="_x0000_i1057" DrawAspect="Content" ObjectID="_1851072669" r:id="rId24"/>
+        </w:object>
       </w:r>
     </w:p>
     <w:p>
@@ -4419,57 +2747,7 @@
           <w:rFonts w:ascii="Calibri" w:eastAsia="Calibri" w:hAnsi="Calibri" w:cs="Calibri"/>
         </w:rPr>
         <w:lastRenderedPageBreak/>
-        <w:t xml:space="preserve">Main es únicamente la capa de interacción: no guarda doctores ni mascotas, solamente un Scanner y un objeto Veterinaria, y cada opción del menú se limita a pedir los datos y delegarlos. Preferí un solo menú con el estado de la sesión impreso arriba, en vez de un submenú por rol, porque las mismas opciones cambian de comportamiento según quién esté </w:t>
-      </w:r>
-      <w:proofErr w:type="spellStart"/>
-      <w:r>
-        <w:rPr>
-          <w:rFonts w:ascii="Calibri" w:eastAsia="Calibri" w:hAnsi="Calibri" w:cs="Calibri"/>
-        </w:rPr>
-        <w:t>logueado</w:t>
-      </w:r>
-      <w:proofErr w:type="spellEnd"/>
-      <w:r>
-        <w:rPr>
-          <w:rFonts w:ascii="Calibri" w:eastAsia="Calibri" w:hAnsi="Calibri" w:cs="Calibri"/>
-        </w:rPr>
-        <w:t xml:space="preserve"> y es la Veterinaria la que decide si la operación procede o no. La lectura de enteros la aislé en </w:t>
-      </w:r>
-      <w:proofErr w:type="spellStart"/>
-      <w:proofErr w:type="gramStart"/>
-      <w:r>
-        <w:rPr>
-          <w:rFonts w:ascii="Calibri" w:eastAsia="Calibri" w:hAnsi="Calibri" w:cs="Calibri"/>
-        </w:rPr>
-        <w:t>leerEntero</w:t>
-      </w:r>
-      <w:proofErr w:type="spellEnd"/>
-      <w:r>
-        <w:rPr>
-          <w:rFonts w:ascii="Calibri" w:eastAsia="Calibri" w:hAnsi="Calibri" w:cs="Calibri"/>
-        </w:rPr>
-        <w:t>(</w:t>
-      </w:r>
-      <w:proofErr w:type="gramEnd"/>
-      <w:r>
-        <w:rPr>
-          <w:rFonts w:ascii="Calibri" w:eastAsia="Calibri" w:hAnsi="Calibri" w:cs="Calibri"/>
-        </w:rPr>
-        <w:t xml:space="preserve">), que atrapa </w:t>
-      </w:r>
-      <w:proofErr w:type="spellStart"/>
-      <w:r>
-        <w:rPr>
-          <w:rFonts w:ascii="Calibri" w:eastAsia="Calibri" w:hAnsi="Calibri" w:cs="Calibri"/>
-        </w:rPr>
-        <w:t>InputMismatchException</w:t>
-      </w:r>
-      <w:proofErr w:type="spellEnd"/>
-      <w:r>
-        <w:rPr>
-          <w:rFonts w:ascii="Calibri" w:eastAsia="Calibri" w:hAnsi="Calibri" w:cs="Calibri"/>
-        </w:rPr>
-        <w:t xml:space="preserve"> y vuelve a pedir el dato, para que escribir una letra en el menú no tumbe el programa. También dejé una opción oculta, la 13, que no se imprime en el menú y ejecuta una prueba automática de todas las operaciones, válidas e inválidas, sobre una veterinaria aparte; es la que usé para verificar la práctica y de donde salieron varias de las capturas de este reporte.</w:t>
+        <w:t>Main es únicamente la capa de interacción: no guarda doctores ni mascotas, solamente un Scanner y un objeto Veterinaria, y cada opción del menú se limita a pedir los datos y delegarlos. Preferí un solo menú con el estado de la sesión impreso arriba, en vez de un submenú por rol, porque las mismas opciones cambian de comportamiento según quién esté logueado y es la Veterinaria la que decide si la operación procede o no. La lectura de enteros la aislé en leerEntero(), que atrapa InputMismatchException y vuelve a pedir el dato, para que escribir una letra en el menú no tumbe el programa. También dejé una opción oculta, la 13, que no se imprime en el menú y ejecuta una prueba automática de todas las operaciones, válidas e inválidas, sobre una veterinaria aparte; es la que usé para verificar la práctica y de donde salieron varias de las capturas de este reporte.</w:t>
       </w:r>
     </w:p>
     <w:p>
@@ -4498,7 +2776,7 @@
                     <pic:cNvPicPr/>
                   </pic:nvPicPr>
                   <pic:blipFill>
-                    <a:blip r:embed="rId17"/>
+                    <a:blip r:embed="rId25"/>
                     <a:stretch>
                       <a:fillRect/>
                     </a:stretch>
@@ -4557,25 +2835,25 @@
         <w:pStyle w:val="Ttulo2"/>
         <w:ind w:left="720"/>
       </w:pPr>
-      <w:bookmarkStart w:id="13" w:name="_Toc239939362"/>
+      <w:bookmarkStart w:id="17" w:name="_Toc239939362"/>
       <w:r>
         <w:t>Reflexión y análisis crítico</w:t>
       </w:r>
-      <w:bookmarkEnd w:id="13"/>
+      <w:bookmarkEnd w:id="17"/>
     </w:p>
     <w:p>
       <w:pPr>
         <w:pStyle w:val="Ttulo3"/>
         <w:spacing w:before="240" w:after="120"/>
       </w:pPr>
-      <w:bookmarkStart w:id="14" w:name="_Toc239939363"/>
+      <w:bookmarkStart w:id="18" w:name="_Toc239939363"/>
       <w:r>
         <w:rPr>
           <w:rFonts w:ascii="Calibri" w:eastAsia="Calibri" w:hAnsi="Calibri" w:cs="Calibri"/>
         </w:rPr>
         <w:t>Dificultades técnicas</w:t>
       </w:r>
-      <w:bookmarkEnd w:id="14"/>
+      <w:bookmarkEnd w:id="18"/>
     </w:p>
     <w:p>
       <w:r>
@@ -4591,73 +2869,18 @@
         <w:pStyle w:val="Ttulo3"/>
         <w:spacing w:before="240" w:after="120"/>
       </w:pPr>
-      <w:bookmarkStart w:id="15" w:name="_Toc239939364"/>
+      <w:bookmarkStart w:id="19" w:name="_Toc239939364"/>
       <w:r>
         <w:rPr>
           <w:rFonts w:ascii="Calibri" w:eastAsia="Calibri" w:hAnsi="Calibri" w:cs="Calibri"/>
         </w:rPr>
         <w:t>Fracasos, fallas, bugs y errores</w:t>
       </w:r>
-      <w:bookmarkEnd w:id="15"/>
-    </w:p>
-    <w:p>
-      <w:r>
-        <w:t xml:space="preserve">El error más molesto fue una excepción en tiempo de ejecución: </w:t>
-      </w:r>
-      <w:proofErr w:type="spellStart"/>
-      <w:proofErr w:type="gramStart"/>
-      <w:r>
-        <w:t>java.util</w:t>
-      </w:r>
-      <w:proofErr w:type="gramEnd"/>
-      <w:r>
-        <w:t>.IllegalFormatConversionException</w:t>
-      </w:r>
-      <w:proofErr w:type="spellEnd"/>
-      <w:r>
-        <w:t xml:space="preserve">: </w:t>
-      </w:r>
-      <w:proofErr w:type="gramStart"/>
-      <w:r>
-        <w:t>d !</w:t>
-      </w:r>
-      <w:proofErr w:type="gramEnd"/>
-      <w:r>
-        <w:t xml:space="preserve">= </w:t>
-      </w:r>
-      <w:proofErr w:type="spellStart"/>
-      <w:proofErr w:type="gramStart"/>
-      <w:r>
-        <w:t>java.lang</w:t>
-      </w:r>
-      <w:proofErr w:type="gramEnd"/>
-      <w:r>
-        <w:t>.String</w:t>
-      </w:r>
-      <w:proofErr w:type="spellEnd"/>
-      <w:r>
-        <w:t xml:space="preserve">, que tumbaba el programa justo al imprimir la primera mascota. En el </w:t>
-      </w:r>
-      <w:proofErr w:type="spellStart"/>
-      <w:r>
-        <w:t>String.format</w:t>
-      </w:r>
-      <w:proofErr w:type="spellEnd"/>
-      <w:r>
-        <w:t xml:space="preserve">() del </w:t>
-      </w:r>
-      <w:proofErr w:type="spellStart"/>
-      <w:proofErr w:type="gramStart"/>
-      <w:r>
-        <w:t>toString</w:t>
-      </w:r>
-      <w:proofErr w:type="spellEnd"/>
-      <w:r>
-        <w:t>(</w:t>
-      </w:r>
-      <w:proofErr w:type="gramEnd"/>
-      <w:r>
-        <w:t>) de Mascota se me había ido el signo de porcentaje del primer especificador: escribí "#-5d" en lugar de "%-5d". Como "#-5d" no es un especificador válido, Java lo tomó como texto normal y no consumió ningún argumento, así que todos los especificadores siguientes se recorrieron un lugar y el %d que era para la edad terminó recibiendo la especie, que es un String. También tuve dos detalles menores: el diagnóstico salía con doble punto al final, porque el formato ya traía un punto fijo y mis textos de prueba también terminaban en punto; y los acentos y la ñ de "Dueño" aparecían como signos de interrogación en la consola.</w:t>
+      <w:bookmarkEnd w:id="19"/>
+    </w:p>
+    <w:p>
+      <w:r>
+        <w:t>El error más molesto fue una excepción en tiempo de ejecución: java.util.IllegalFormatConversionException: d != java.lang.String, que tumbaba el programa justo al imprimir la primera mascota. En el String.format() del toString() de Mascota se me había ido el signo de porcentaje del primer especificador: escribí "#-5d" en lugar de "%-5d". Como "#-5d" no es un especificador válido, Java lo tomó como texto normal y no consumió ningún argumento, así que todos los especificadores siguientes se recorrieron un lugar y el %d que era para la edad terminó recibiendo la especie, que es un String. También tuve dos detalles menores: el diagnóstico salía con doble punto al final, porque el formato ya traía un punto fijo y mis textos de prueba también terminaban en punto; y los acentos y la ñ de "Dueño" aparecían como signos de interrogación en la consola.</w:t>
       </w:r>
     </w:p>
     <w:p>
@@ -4665,50 +2888,18 @@
         <w:pStyle w:val="Ttulo3"/>
         <w:spacing w:before="240" w:after="120"/>
       </w:pPr>
-      <w:bookmarkStart w:id="16" w:name="_Toc239939365"/>
+      <w:bookmarkStart w:id="20" w:name="_Toc239939365"/>
       <w:r>
         <w:rPr>
           <w:rFonts w:ascii="Calibri" w:eastAsia="Calibri" w:hAnsi="Calibri" w:cs="Calibri"/>
         </w:rPr>
         <w:t>Cómo se resolvió</w:t>
       </w:r>
-      <w:bookmarkEnd w:id="16"/>
-    </w:p>
-    <w:p>
-      <w:r>
-        <w:t xml:space="preserve">La excepción la ubiqué leyendo la traza de la pila de abajo hacia arriba: la última línea que pertenecía a mi código era </w:t>
-      </w:r>
-      <w:proofErr w:type="spellStart"/>
-      <w:r>
-        <w:t>Mascota.toString</w:t>
-      </w:r>
-      <w:proofErr w:type="spellEnd"/>
-      <w:r>
-        <w:t xml:space="preserve">(), así que el problema estaba ahí y no donde parecía. Agregando el signo de porcentaje que faltaba quedó resuelto, y de paso entendí que un especificador mal escrito no da error de compilación, solo recorre los argumentos y truena hasta que corres el programa. El doble punto lo arreglé quitando el punto fijo del formato, para que se imprima tal cual venga el texto del diagnóstico. Y lo de los acentos no era un problema del código sino de la codificación de la consola: se corrigió compilando con </w:t>
-      </w:r>
-      <w:proofErr w:type="spellStart"/>
-      <w:r>
-        <w:t>javac</w:t>
-      </w:r>
-      <w:proofErr w:type="spellEnd"/>
-      <w:r>
-        <w:t xml:space="preserve"> -</w:t>
-      </w:r>
-      <w:proofErr w:type="spellStart"/>
-      <w:r>
-        <w:t>encoding</w:t>
-      </w:r>
-      <w:proofErr w:type="spellEnd"/>
-      <w:r>
-        <w:t xml:space="preserve"> UTF-8 y poniendo la consola en UTF-8 con </w:t>
-      </w:r>
-      <w:proofErr w:type="spellStart"/>
-      <w:r>
-        <w:t>chcp</w:t>
-      </w:r>
-      <w:proofErr w:type="spellEnd"/>
-      <w:r>
-        <w:t xml:space="preserve"> 65001 antes de ejecutar.</w:t>
+      <w:bookmarkEnd w:id="20"/>
+    </w:p>
+    <w:p>
+      <w:r>
+        <w:t>La excepción la ubiqué leyendo la traza de la pila de abajo hacia arriba: la última línea que pertenecía a mi código era Mascota.toString(), así que el problema estaba ahí y no donde parecía. Agregando el signo de porcentaje que faltaba quedó resuelto, y de paso entendí que un especificador mal escrito no da error de compilación, solo recorre los argumentos y truena hasta que corres el programa. Y lo de los acentos no era un problema del código sino de la codificación de la consola: se corrigió compilando con javac -encoding UTF-8 y poniendo la consola en UTF-8 con chcp 65001 antes de ejecutar.</w:t>
       </w:r>
     </w:p>
     <w:p>
@@ -4716,24 +2907,22 @@
         <w:pStyle w:val="Ttulo3"/>
         <w:spacing w:before="240" w:after="120"/>
       </w:pPr>
-      <w:bookmarkStart w:id="17" w:name="_Toc239939366"/>
+      <w:bookmarkStart w:id="21" w:name="_Toc239939366"/>
       <w:r>
         <w:rPr>
           <w:rFonts w:ascii="Calibri" w:eastAsia="Calibri" w:hAnsi="Calibri" w:cs="Calibri"/>
         </w:rPr>
         <w:t>Conclusión</w:t>
       </w:r>
-      <w:bookmarkEnd w:id="17"/>
+      <w:bookmarkEnd w:id="21"/>
     </w:p>
     <w:p>
       <w:r>
         <w:t xml:space="preserve">Esta práctica me sirvió para ver la diferencia real entre composición y asociación, que hasta ahora se me hacía una distinción más de diagrama que de código. Al implementarla queda claro que no se trata de cómo se dibuja la flecha, sino de quién crea el objeto y quién puede destruirlo: la Veterinaria crea y elimina doctores y mascotas, mientras que el Doctor solo apunta a mascotas que ya existían. También me quedó la idea de que el control de acceso conviene ponerlo en la clase que tiene las reglas y no en el menú, porque así la validación se </w:t>
       </w:r>
-      <w:proofErr w:type="gramStart"/>
-      <w:r>
-        <w:t>cumple</w:t>
-      </w:r>
-      <w:proofErr w:type="gramEnd"/>
+      <w:r>
+        <w:t>cumple,</w:t>
+      </w:r>
       <w:r>
         <w:t xml:space="preserve"> aunque después se agregue otra forma de llamar a esos métodos.</w:t>
       </w:r>
@@ -4747,11 +2936,11 @@
           <w:numId w:val="9"/>
         </w:numPr>
       </w:pPr>
-      <w:bookmarkStart w:id="18" w:name="_Toc239939367"/>
+      <w:bookmarkStart w:id="22" w:name="_Toc239939367"/>
       <w:r>
         <w:t>Bibliografía</w:t>
       </w:r>
-      <w:bookmarkEnd w:id="18"/>
+      <w:bookmarkEnd w:id="22"/>
     </w:p>
     <w:p>
       <w:pPr>
@@ -4764,25 +2953,9 @@
         <w:jc w:val="both"/>
       </w:pPr>
       <w:r>
-        <w:t xml:space="preserve">Oracle </w:t>
-      </w:r>
-      <w:proofErr w:type="spellStart"/>
-      <w:r>
-        <w:t>Corporation</w:t>
-      </w:r>
-      <w:proofErr w:type="spellEnd"/>
-      <w:r>
-        <w:t xml:space="preserve">. (2024). Java SE </w:t>
-      </w:r>
-      <w:proofErr w:type="spellStart"/>
-      <w:r>
-        <w:t>Documentation</w:t>
-      </w:r>
-      <w:proofErr w:type="spellEnd"/>
-      <w:r>
-        <w:t xml:space="preserve">. Recuperado de </w:t>
-      </w:r>
-      <w:hyperlink r:id="rId18" w:history="1">
+        <w:t xml:space="preserve">Oracle Corporation. (2024). Java SE Documentation. Recuperado de </w:t>
+      </w:r>
+      <w:hyperlink r:id="rId26" w:history="1">
         <w:r>
           <w:rPr>
             <w:rStyle w:val="Hipervnculo"/>
@@ -4802,31 +2975,7 @@
         <w:jc w:val="both"/>
       </w:pPr>
       <w:r>
-        <w:t xml:space="preserve">Deitel, P. J., &amp; Deitel, H. M. (2016). Java: How </w:t>
-      </w:r>
-      <w:proofErr w:type="spellStart"/>
-      <w:r>
-        <w:t>to</w:t>
-      </w:r>
-      <w:proofErr w:type="spellEnd"/>
-      <w:r>
-        <w:t xml:space="preserve"> </w:t>
-      </w:r>
-      <w:proofErr w:type="spellStart"/>
-      <w:r>
-        <w:t>Program</w:t>
-      </w:r>
-      <w:proofErr w:type="spellEnd"/>
-      <w:r>
-        <w:t xml:space="preserve"> (10th ed.). Pearson </w:t>
-      </w:r>
-      <w:proofErr w:type="spellStart"/>
-      <w:r>
-        <w:t>Education</w:t>
-      </w:r>
-      <w:proofErr w:type="spellEnd"/>
-      <w:r>
-        <w:t>.</w:t>
+        <w:t>Deitel, P. J., &amp; Deitel, H. M. (2016). Java: How to Program (10th ed.). Pearson Education.</w:t>
       </w:r>
     </w:p>
     <w:sectPr>
@@ -7951,6 +6100,26 @@
 </a:theme>
 </file>
 
+<file path=word/webextensions/taskpanes.xml><?xml version="1.0" encoding="utf-8"?>
+<wetp:taskpanes xmlns:wetp="http://schemas.microsoft.com/office/webextensions/taskpanes/2010/11">
+  <wetp:taskpane dockstate="right" visibility="0" width="438" row="3">
+    <wetp:webextensionref xmlns:r="http://schemas.openxmlformats.org/officeDocument/2006/relationships" r:id="rId1"/>
+  </wetp:taskpane>
+</wetp:taskpanes>
+</file>
+
+<file path=word/webextensions/webextension1.xml><?xml version="1.0" encoding="utf-8"?>
+<we:webextension xmlns:we="http://schemas.microsoft.com/office/webextensions/webextension/2010/11" id="{B72C3ACE-CC40-4303-BC7E-C8BB6AA76F93}">
+  <we:reference id="wa200000113" version="1.0.0.0" store="es-ES" storeType="OMEX"/>
+  <we:alternateReferences>
+    <we:reference id="WA200000113" version="1.0.0.0" store="" storeType="OMEX"/>
+  </we:alternateReferences>
+  <we:properties/>
+  <we:bindings/>
+  <we:snapshot xmlns:r="http://schemas.openxmlformats.org/officeDocument/2006/relationships"/>
+</we:webextension>
+</file>
+
 <file path=customXml/item1.xml><?xml version="1.0" encoding="utf-8"?>
 <b:Sources xmlns:b="http://schemas.openxmlformats.org/officeDocument/2006/bibliography" xmlns="http://schemas.openxmlformats.org/officeDocument/2006/bibliography" SelectedStyle="\APASixthEditionOfficeOnline.xsl" StyleName="APA" Version="6"/>
 </file>

</xml_diff>